<commit_message>
Align the test report and the presentation script with proposal v1.1
</commit_message>
<xml_diff>
--- a/docs/ACBI_bai_trinh_bay.docx
+++ b/docs/ACBI_bai_trinh_bay.docx
@@ -995,7 +995,7 @@
           <w:b w:val="0"/>
           <w:i w:val="0"/>
         </w:rPr>
-        <w:t>Về kiến trúc, có ba khối chính: giao diện web, backend, và lưu trữ ứng dụng. Backend chia thành các phần rõ ràng: điều phối, phân quyền, hội thoại, tích hợp AI, định nghĩa chỉ số, dựng và kiểm tra SQL, trình bày kết quả, lịch sử và nhật ký. Hai dịch vụ bên ngoài là mô hình ngôn ngữ và dịch vụ chuyển giọng nói thành văn bản, đều gọi qua kết nối mã hoá với khoá giữ trên máy chủ. Kho dữ liệu công ty được truy cập bằng tài khoản chỉ đọc; AI không có đường nào tới kho dữ liệu. Dịch vụ AI chỉ nhận câu hỏi, định nghĩa chỉ số, tên bảng và cột, vài câu SQL mẫu và, khi hỏi nối tiếp, các câu trả lời trước đã bỏ số tiền; không nhận dòng kết quả. Triển khai bằng Docker Compose với ba container: web, backend và cơ sở dữ liệu ứng dụng.</w:t>
+        <w:t>Về kiến trúc, có ba khối chính: giao diện web, backend, và lưu trữ ứng dụng. Backend chia thành các phần rõ ràng: điều phối, phân quyền, hội thoại, tích hợp AI, định nghĩa chỉ số, dựng và kiểm tra SQL, trình bày kết quả, lịch sử và nhật ký. Hai dịch vụ bên ngoài là mô hình ngôn ngữ và dịch vụ chuyển giọng nói thành văn bản, đều gọi qua kết nối mã hoá với khoá giữ trên máy chủ. Kho dữ liệu công ty được truy cập bằng tài khoản chỉ đọc; AI không có đường nào tới kho dữ liệu. Dịch vụ AI chỉ nhận câu hỏi, định nghĩa chỉ số, tên bảng và cột, vài câu SQL mẫu và, khi hỏi nối tiếp, các lượt gần nhất đã thay số tiền và tỷ lệ có định dạng bằng ký hiệu; riêng khi người dùng hỏi về chính câu trả lời vừa rồi thì văn bản câu trả lời được gửi kèm; không nhận dòng kết quả. Triển khai bằng Docker Compose với ba container: web, backend và cơ sở dữ liệu ứng dụng.</w:t>
       </w:r>
     </w:p>
     <w:p>
@@ -1029,7 +1029,7 @@
           <w:b w:val="0"/>
           <w:i w:val="0"/>
         </w:rPr>
-        <w:t>Mỗi câu hỏi đi qua năm bước. Đầu tiên hệ thống hiểu câu hỏi; nếu thiếu thông tin, ví dụ chưa nói kỳ nào, hệ thống hỏi lại và nhớ ngữ cảnh của cuộc trò chuyện. Thứ hai là kiểm tra quyền: yêu cầu ngoài quyền bị từ chối, ghi nhật ký, và không có truy vấn nào được chạy. Bước dựng truy vấn có hai đường. Câu hỏi phổ biến đi đường mẫu: SQL được dựng từ mẫu theo định nghĩa chỉ số đã duyệt, nên nhiều cách hỏi khác nhau vẫn cho cùng một kết quả. Câu hỏi ngoài mẫu, ví dụ theo tuần hay theo ngày, đi đường RAG Text-to-SQL: hệ thống lấy định nghĩa và ví dụ liên quan để AI đề xuất SQL; nếu SQL lệch khuôn đã duyệt, AI được sửa tối đa hai lần. Cả hai đường đều qua cùng một lớp kiểm tra SQL rồi mới chạy.</w:t>
+        <w:t>Mỗi câu hỏi đi qua năm bước. Đầu tiên hệ thống hiểu câu hỏi, bằng AI, hoặc bằng quy tắc nếu bật tùy chọn đó hoặc khi AI đang bận; riêng vai trò IT quản trị bị từ chối ngay từ đầu. Nếu thiếu thông tin, ví dụ chưa nói kỳ nào, hệ thống hỏi lại và nhớ ngữ cảnh của cuộc trò chuyện. Thứ hai là kiểm tra quyền: yêu cầu ngoài quyền bị từ chối, ghi nhật ký, và không có truy vấn nào được chạy. Bước dựng truy vấn có hai đường. Câu hỏi phổ biến đi đường mẫu: SQL được dựng từ mẫu theo định nghĩa chỉ số đã duyệt, nên nhiều cách hỏi khác nhau vẫn cho cùng một kết quả. Câu hỏi ngoài mẫu, ví dụ theo tuần hay theo ngày, đi đường RAG Text-to-SQL: hệ thống lấy định nghĩa và ví dụ liên quan để AI đề xuất SQL; nếu SQL lệch khuôn đã duyệt, AI được sửa tối đa hai lần. Cả hai đường đều qua cùng một lớp kiểm tra SQL rồi mới chạy.</w:t>
       </w:r>
     </w:p>
     <w:p>
@@ -1199,7 +1199,7 @@
           <w:b w:val="0"/>
           <w:i w:val="0"/>
         </w:rPr>
-        <w:t>Hệ thống còn dự báo được doanh thu và sản lượng. Dự báo dùng phương pháp làm trơn hàm mũ, đúng phương pháp của gói forecast trong R và thư viện statsmodels, chọn mô hình theo tiêu chí AICc; tôi đã đối chiếu và kết quả khớp statsmodels. Câu trả lời luôn mở đầu bằng "Dự báo, không phải số liệu đã ghi nhận", kèm khoảng tin cậy 95% và sai số kiểm thử. Quan trọng nhất: hệ thống thử dự báo lại 6 tháng gần nhất; nếu lệch quá 35% thì từ chối, không đưa ra con số. Trên dữ liệu mẫu, vài khu vực như Pháp, Canada bị từ chối vì lý do này. Chúng tôi cũng thử lùi dần nhiều mốc trên dữ liệu mẫu và so với phương pháp đơn giản như lấy tháng trước hoặc trung bình ba tháng: sai số khoảng 18 đến 26 phần trăm, tương đương các phương pháp đó. Vì vậy dự báo luôn kèm sai số và có cơ chế từ chối, và chúng tôi không quảng bá độ chính xác của nó. Lưu ý: tháng 05/2025 của dữ liệu mẫu gần như trống, nên đường dự báo ở đây thấp hơn các tháng trước.</w:t>
+        <w:t>Hệ thống còn dự báo được doanh thu và sản lượng. Dự báo dùng phương pháp làm trơn hàm mũ, đúng phương pháp của gói forecast trong R và thư viện statsmodels, chọn mô hình theo tiêu chí AICc; tôi đã đối chiếu và kết quả khớp statsmodels. Câu trả lời luôn mở đầu bằng "Dự báo, không phải số liệu đã ghi nhận", kèm khoảng tin cậy 95% và sai số kiểm thử. Quan trọng nhất: hệ thống thử dự báo lại 6 tháng gần nhất; nếu lệch quá 35% thì từ chối, không đưa ra con số. Trên dữ liệu mẫu, vài khu vực như Pháp, Canada bị từ chối vì lý do này. Chúng tôi cũng thử lùi dần nhiều mốc trên dữ liệu mẫu và so với phương pháp đơn giản như lấy tháng trước hoặc trung bình ba tháng: sai số khoảng 18 đến 26 phần trăm, tương đương các phương pháp đó. Vì vậy dự báo luôn kèm sai số và có cơ chế từ chối, và chúng tôi không quảng bá độ chính xác của nó. Lưu ý: tháng 05/2025 của dữ liệu mẫu gần như trống, nên đường dự báo ở đây thấp hơn các tháng trước. Đây là chức năng tạm thời: phạm vi dự báo phụ thuộc nghiệp vụ nên chưa đưa vào tài liệu giải pháp v1.1.</w:t>
       </w:r>
     </w:p>
     <w:p>
@@ -1323,7 +1323,7 @@
           <w:color w:val="555B66"/>
           <w:sz w:val="20"/>
         </w:rPr>
-        <w:t>Trên slide: API Claude Haiku 5.5 khoảng 16 USD mỗi tháng cho 20.000 câu; máy chủ GPU khoảng 200 đến 500 USD mỗi tháng cố định; hòa vốn khoảng 250.000 câu mỗi tháng.</w:t>
+        <w:t>Trên slide: API Claude Haiku 5.5 khoảng 16 USD mỗi tháng cho 20.000 câu; máy chủ GPU khoảng 200 đến 500 USD mỗi tháng cố định; hòa vốn khoảng 250.000 đến 630.000 câu mỗi tháng.</w:t>
       </w:r>
     </w:p>
     <w:p>
@@ -1335,7 +1335,7 @@
           <w:b w:val="0"/>
           <w:i w:val="0"/>
         </w:rPr>
-        <w:t>Về chi phí, có hai hướng. Hướng thứ nhất là dùng API Claude. Với mô hình Haiku 5.5, chi phí khoảng 16 đô la mỗi tháng cho 20.000 câu hỏi, và đó là tính trong kịch bản xấu nhất khi mọi câu đều phải gọi AI; thực tế nhiều câu được trả lời từ từ điển nên không tốn gì. Sonnet đắt hơn khoảng 20 lần, chỉ dùng nếu Haiku chưa đủ chất lượng. Hướng thứ hai là thuê hoặc mua máy chủ GPU để chạy mô hình offline: khoảng 200 đến 500 đô la mỗi tháng, cố định, chưa tính người vận hành, nhưng dữ liệu không ra khỏi công ty. Điểm hòa vốn khoảng 250.000 câu mỗi tháng, nên với quy mô thí điểm, API rẻ hơn nhiều. Xin lưu ý đây là ước tính: chúng tôi chưa chạy bộ kiểm thử trên Claude, và chi phí nhân sự chưa được điền.</w:t>
+        <w:t>Về chi phí, có hai hướng. Hướng thứ nhất là dùng API Claude. Với mô hình Haiku 5.5, chi phí khoảng 16 đô la mỗi tháng cho 20.000 câu hỏi, và đó là tính trong kịch bản xấu nhất khi mọi câu đều phải gọi AI; khi bật tùy chọn đọc câu bằng quy tắc, như trên bản demo, nhiều câu rõ ràng không cần gọi AI; tùy chọn này mặc định tắt. Sonnet đắt hơn khoảng 20 lần, chỉ dùng nếu Haiku chưa đủ chất lượng. Hướng thứ hai là thuê hoặc mua máy chủ GPU để chạy mô hình offline: khoảng 200 đến 500 đô la mỗi tháng, cố định, chưa tính người vận hành, nhưng dữ liệu không ra khỏi công ty. Điểm hòa vốn khoảng 250.000 đến 630.000 câu mỗi tháng tùy giá máy chủ, nên với quy mô thí điểm, API rẻ hơn nhiều. Xin lưu ý đây là ước tính: chúng tôi chưa chạy bộ kiểm thử trên Claude, và chi phí nhân sự chưa được điền.</w:t>
       </w:r>
     </w:p>
     <w:p>
@@ -1369,7 +1369,7 @@
           <w:b w:val="0"/>
           <w:i w:val="0"/>
         </w:rPr>
-        <w:t>Bốn rủi ro chính đã được nêu trong tài liệu cùng cách giảm thiểu: kết quả sai dù SQL vẫn chạy được, lộ dữ liệu ngoài quyền, phụ thuộc vào dịch vụ AI bên ngoài, và phạm vi kiểm thử còn hẹp. Bước tiếp theo, tôi đề xuất năm việc: chuyển sang gói AI trả phí rồi đo lại tải, vì kết quả đo hôm nay bị giới hạn bởi quota miễn phí; chốt định nghĩa chỉ số và phân quyền cùng các phòng ban; xây bộ 100 đến 200 câu hỏi thật và chạy nhiều lần để đo độ ổn định; chạy thử với dữ liệu thật của công ty; và cập nhật tài liệu lên bản 1.1, bổ sung chức năng dự báo, cách chọn biểu đồ và ước tính chi phí.</w:t>
+        <w:t>Bốn rủi ro chính đã được nêu trong tài liệu cùng cách giảm thiểu: kết quả sai dù SQL vẫn chạy được, lộ dữ liệu ngoài quyền, phụ thuộc vào dịch vụ AI bên ngoài, và phạm vi kiểm thử còn hẹp. Bước tiếp theo, tôi đề xuất năm việc: chuyển sang gói AI trả phí rồi đo lại tải, vì kết quả đo hôm nay bị giới hạn bởi quota miễn phí; chốt định nghĩa chỉ số và phân quyền cùng các phòng ban; xây bộ 100 đến 200 câu hỏi thật và chạy nhiều lần để đo độ ổn định; chạy thử với dữ liệu thật của công ty; và tài liệu đã được cập nhật lên bản 1.1 với dữ liệu gửi cho AI, cách chọn biểu đồ và ước tính chi phí; chức năng dự báo chưa đưa vào tài liệu vì còn phụ thuộc nghiệp vụ. Ở bản vận hành chúng tôi dùng một nhà cung cấp trả phí hoặc mô hình offline; việc xoay vòng nhiều nhà cung cấp miễn phí chỉ là phương án tạm cho giai đoạn demo.</w:t>
       </w:r>
     </w:p>
     <w:p>
@@ -1455,7 +1455,7 @@
           <w:b w:val="0"/>
           <w:i w:val="0"/>
         </w:rPr>
-        <w:t>Có hai dịch vụ bên ngoài: dịch vụ AI và dịch vụ chuyển giọng nói. Dịch vụ AI nhận câu hỏi của người dùng, định nghĩa chỉ số, tên bảng và cột được phép, tối đa hai SQL mẫu, mô tả cột của kết quả để chọn biểu đồ, và khi hỏi nối tiếp thì các câu trả lời trước đã thay số tiền, tỷ lệ bằng [số]; việc gửi các thông tin này đã được chủ dự án duyệt ngày 20/09/2026. Không gửi các dòng kết quả (tóm tắt bằng AI mặc định tắt). Chưa có: rà soát điều khoản lưu giữ dữ liệu của từng nhà cung cấp, đặc biệt gói miễn phí, và pentest độc lập (xem sheet Dữ liệu gửi cho AI). Kho dữ liệu chỉ được truy cập bằng tài khoản chỉ đọc từ phía backend.</w:t>
+        <w:t>Có hai dịch vụ bên ngoài: dịch vụ AI và dịch vụ chuyển giọng nói. Dịch vụ AI nhận câu hỏi của người dùng, định nghĩa chỉ số, tên bảng và cột được phép, tối đa hai SQL mẫu, mô tả cột của kết quả để chọn biểu đồ (chỉ khi quy tắc của backend không chọn được), và khi hỏi nối tiếp thì các lượt gần nhất với số tiền, tỷ lệ có định dạng đã thay bằng [số]; riêng khi người dùng hỏi về chính câu trả lời vừa rồi thì văn bản câu trả lời được gửi kèm số liệu; việc gửi các thông tin này đã được chủ dự án duyệt ngày 20/09/2026. Không gửi các dòng kết quả (tóm tắt bằng AI mặc định tắt). Chưa có: rà soát điều khoản lưu giữ dữ liệu của từng nhà cung cấp, đặc biệt gói miễn phí, và pentest độc lập (xem sheet Dữ liệu gửi cho AI). Kho dữ liệu chỉ được truy cập bằng tài khoản chỉ đọc từ phía backend.</w:t>
       </w:r>
     </w:p>
     <w:p>
@@ -1518,7 +1518,7 @@
           <w:i w:val="0"/>
           <w:color w:val="14213D"/>
         </w:rPr>
-        <w:t>Vì sao đo tải chỉ đạt 57%?</w:t>
+        <w:t>Vì sao đo tải chỉ đạt 65%?</w:t>
       </w:r>
     </w:p>
     <w:p>
@@ -1555,7 +1555,7 @@
           <w:b w:val="0"/>
           <w:i w:val="0"/>
         </w:rPr>
-        <w:t>Hai hướng, theo ước tính (xem sheet Chi phí trong file Excel): (1) API Claude Haiku 5.5 khoảng 4 USD mỗi tháng cho 5.000 câu, 16 USD cho 20.000 câu và 79 USD cho 100.000 câu, tính trong kịch bản xấu nhất khi mọi câu đều gọi AI; Sonnet 5.5 đắt gấp khoảng 20 lần. (2) Máy chủ GPU chạy mô hình offline khoảng 200 đến 500 USD mỗi tháng cố định (Hetzner GEX44 184 euro mỗi tháng; thuê RTX 4090 theo giờ 0,34 đến 0,69 USD), chưa gồm nhân sự. Máy chủ riêng chỉ rẻ hơn khi trên khoảng 250.000 câu mỗi tháng. Giả định: token đo trên lời nhắc thật, nhân 1,3; chưa chạy bộ kiểm thử trên Claude; chi phí nhân sự: [chưa có, cần điền]; giá cần xác nhận lại.</w:t>
+        <w:t>Hai hướng, theo ước tính (xem sheet Chi phí trong file Excel): (1) API Claude Haiku 5.5 khoảng 4 USD mỗi tháng cho 5.000 câu, 16 USD cho 20.000 câu và 79 USD cho 100.000 câu, tính trong kịch bản xấu nhất khi mọi câu đều gọi AI; Sonnet 5.5 đắt gấp khoảng 20 lần. (2) Máy chủ GPU chạy mô hình offline khoảng 200 đến 500 USD mỗi tháng cố định (Hetzner GEX44 184 euro mỗi tháng; thuê RTX 4090 theo giờ 0,34 đến 0,69 USD), chưa gồm nhân sự. Máy chủ riêng chỉ rẻ hơn khi trên khoảng 250.000 đến 630.000 câu mỗi tháng tùy giá máy chủ. Giả định: token đo trên lời nhắc thật, nhân 1,3; chưa chạy bộ kiểm thử trên Claude; chi phí nhân sự: [chưa có, cần điền]; giá cần xác nhận lại.</w:t>
       </w:r>
     </w:p>
     <w:p>
@@ -1655,7 +1655,7 @@
           <w:b w:val="0"/>
           <w:i w:val="0"/>
         </w:rPr>
-        <w:t>Hệ thống dùng nhiều nhà cung cấp AI, xoay vòng khi một nhà hết hạn mức hoặc quá tải, và người dùng có thể chọn AI trong giao diện, xem nhà nào đang nghỉ. Khi mọi nhà đều bận, hệ thống báo rõ để thử lại, không trả kết quả sai.</w:t>
+        <w:t>Bản demo xoay vòng nhiều nhà cung cấp AI miễn phí để tránh chi phí; đó chỉ là phương án tạm. Bản vận hành dùng một nhà cung cấp trả phí hoặc mô hình offline. Khi nhà cung cấp hết hạn mức hoặc quá tải, hệ thống báo rõ để thử lại, không trả kết quả sai; câu đơn giản và câu nối tiếp ngắn mà quy tắc của backend đọc được vẫn được trả lời.</w:t>
       </w:r>
     </w:p>
     <w:p>

</xml_diff>

<commit_message>
Presentation script: add the data-sent and decisions slides
</commit_message>
<xml_diff>
--- a/docs/ACBI_bai_trinh_bay.docx
+++ b/docs/ACBI_bai_trinh_bay.docx
@@ -57,7 +57,7 @@
           <w:b w:val="0"/>
           <w:i w:val="0"/>
         </w:rPr>
-        <w:t>Bài gồm 16 slide, thời lượng nói khoảng 11 phút 5 giây, chưa tính hỏi đáp. Mỗi slide có phần chữ trên slide (để nhớ ý) và phần lời nói đầy đủ để đọc hoặc nói theo.</w:t>
+        <w:t>Bài gồm 18 slide, thời lượng nói khoảng 12 phút 40 giây, chưa tính hỏi đáp. Mỗi slide có phần chữ trên slide (để nhớ ý) và phần lời nói đầy đủ để đọc hoặc nói theo.</w:t>
       </w:r>
     </w:p>
     <w:p>
@@ -336,6 +336,47 @@
               <w:rPr>
                 <w:sz w:val="20"/>
               </w:rPr>
+              <w:t>Dữ liệu gửi cho AI: AI nhận gì, và không bao giờ nhận gì</w:t>
+            </w:r>
+          </w:p>
+        </w:tc>
+        <w:tc>
+          <w:tcPr>
+            <w:tcW w:type="dxa" w:w="1928"/>
+          </w:tcPr>
+          <w:p>
+            <w:r>
+              <w:rPr>
+                <w:sz w:val="20"/>
+              </w:rPr>
+              <w:t>50 giây</w:t>
+            </w:r>
+          </w:p>
+        </w:tc>
+      </w:tr>
+      <w:tr>
+        <w:tc>
+          <w:tcPr>
+            <w:tcW w:type="dxa" w:w="907"/>
+          </w:tcPr>
+          <w:p>
+            <w:r>
+              <w:rPr>
+                <w:sz w:val="20"/>
+              </w:rPr>
+              <w:t>6</w:t>
+            </w:r>
+          </w:p>
+        </w:tc>
+        <w:tc>
+          <w:tcPr>
+            <w:tcW w:type="dxa" w:w="6576"/>
+          </w:tcPr>
+          <w:p>
+            <w:r>
+              <w:rPr>
+                <w:sz w:val="20"/>
+              </w:rPr>
               <w:t>Luồng xử lý: mỗi câu hỏi đi qua năm bước kiểm soát</w:t>
             </w:r>
           </w:p>
@@ -364,7 +405,48 @@
               <w:rPr>
                 <w:sz w:val="20"/>
               </w:rPr>
-              <w:t>6</w:t>
+              <w:t>7</w:t>
+            </w:r>
+          </w:p>
+        </w:tc>
+        <w:tc>
+          <w:tcPr>
+            <w:tcW w:type="dxa" w:w="6576"/>
+          </w:tcPr>
+          <w:p>
+            <w:r>
+              <w:rPr>
+                <w:sz w:val="20"/>
+              </w:rPr>
+              <w:t>Vì sao chọn cách này</w:t>
+            </w:r>
+          </w:p>
+        </w:tc>
+        <w:tc>
+          <w:tcPr>
+            <w:tcW w:type="dxa" w:w="1928"/>
+          </w:tcPr>
+          <w:p>
+            <w:r>
+              <w:rPr>
+                <w:sz w:val="20"/>
+              </w:rPr>
+              <w:t>45 giây</w:t>
+            </w:r>
+          </w:p>
+        </w:tc>
+      </w:tr>
+      <w:tr>
+        <w:tc>
+          <w:tcPr>
+            <w:tcW w:type="dxa" w:w="907"/>
+          </w:tcPr>
+          <w:p>
+            <w:r>
+              <w:rPr>
+                <w:sz w:val="20"/>
+              </w:rPr>
+              <w:t>8</w:t>
             </w:r>
           </w:p>
         </w:tc>
@@ -405,7 +487,7 @@
               <w:rPr>
                 <w:sz w:val="20"/>
               </w:rPr>
-              <w:t>7</w:t>
+              <w:t>9</w:t>
             </w:r>
           </w:p>
         </w:tc>
@@ -446,7 +528,7 @@
               <w:rPr>
                 <w:sz w:val="20"/>
               </w:rPr>
-              <w:t>8</w:t>
+              <w:t>10</w:t>
             </w:r>
           </w:p>
         </w:tc>
@@ -487,7 +569,7 @@
               <w:rPr>
                 <w:sz w:val="20"/>
               </w:rPr>
-              <w:t>9</w:t>
+              <w:t>11</w:t>
             </w:r>
           </w:p>
         </w:tc>
@@ -528,7 +610,7 @@
               <w:rPr>
                 <w:sz w:val="20"/>
               </w:rPr>
-              <w:t>10</w:t>
+              <w:t>12</w:t>
             </w:r>
           </w:p>
         </w:tc>
@@ -569,7 +651,7 @@
               <w:rPr>
                 <w:sz w:val="20"/>
               </w:rPr>
-              <w:t>11</w:t>
+              <w:t>13</w:t>
             </w:r>
           </w:p>
         </w:tc>
@@ -610,7 +692,7 @@
               <w:rPr>
                 <w:sz w:val="20"/>
               </w:rPr>
-              <w:t>12</w:t>
+              <w:t>14</w:t>
             </w:r>
           </w:p>
         </w:tc>
@@ -651,7 +733,7 @@
               <w:rPr>
                 <w:sz w:val="20"/>
               </w:rPr>
-              <w:t>13</w:t>
+              <w:t>15</w:t>
             </w:r>
           </w:p>
         </w:tc>
@@ -692,7 +774,7 @@
               <w:rPr>
                 <w:sz w:val="20"/>
               </w:rPr>
-              <w:t>14</w:t>
+              <w:t>16</w:t>
             </w:r>
           </w:p>
         </w:tc>
@@ -733,7 +815,7 @@
               <w:rPr>
                 <w:sz w:val="20"/>
               </w:rPr>
-              <w:t>15</w:t>
+              <w:t>17</w:t>
             </w:r>
           </w:p>
         </w:tc>
@@ -774,7 +856,7 @@
               <w:rPr>
                 <w:sz w:val="20"/>
               </w:rPr>
-              <w:t>16</w:t>
+              <w:t>18</w:t>
             </w:r>
           </w:p>
         </w:tc>
@@ -843,7 +925,7 @@
                 <w:b/>
                 <w:sz w:val="20"/>
               </w:rPr>
-              <w:t>11 phút 5 giây</w:t>
+              <w:t>12 phút 40 giây</w:t>
             </w:r>
           </w:p>
         </w:tc>
@@ -1003,7 +1085,41 @@
         <w:pStyle w:val="Heading2"/>
       </w:pPr>
       <w:r>
-        <w:t>Slide 5 · Luồng xử lý: mỗi câu hỏi đi qua năm bước kiểm soát  (~60 giây)</w:t>
+        <w:t>Slide 5 · Dữ liệu gửi cho AI: AI nhận gì, và không bao giờ nhận gì  (~50 giây)</w:t>
+      </w:r>
+    </w:p>
+    <w:p>
+      <w:pPr>
+        <w:spacing w:after="80" w:line="300" w:lineRule="auto"/>
+      </w:pPr>
+      <w:r>
+        <w:rPr>
+          <w:b w:val="0"/>
+          <w:i/>
+          <w:color w:val="555B66"/>
+          <w:sz w:val="20"/>
+        </w:rPr>
+        <w:t>Trên slide: Từng lần gọi AI nhận gì; không bao giờ gửi bảng kết quả, mật khẩu, khóa, vai trò; điều kiện trước khi dùng dữ liệu thật.</w:t>
+      </w:r>
+    </w:p>
+    <w:p>
+      <w:pPr>
+        <w:spacing w:after="200" w:line="300" w:lineRule="auto"/>
+      </w:pPr>
+      <w:r>
+        <w:rPr>
+          <w:b w:val="0"/>
+          <w:i w:val="0"/>
+        </w:rPr>
+        <w:t>Câu hỏi hội đồng hay hỏi nhất: dữ liệu của chúng tôi có bị gửi ra ngoài không? Đây là toàn bộ những gì dịch vụ AI nhận được, theo từng lần gọi. Khi hiểu câu hỏi, AI nhận câu hỏi, danh mục chỉ số đã duyệt và vài lượt hội thoại gần nhất, trong đó số tiền đã được che. Khi người dùng hỏi về dữ liệu hoặc về câu trả lời vừa rồi, AI nhận thêm văn bản của câu trả lời đó, kể cả số liệu. Khi viết SQL cho câu lạ, AI nhận định nghĩa chỉ số, tên bảng và cột được phép, tối đa hai SQL mẫu. Khi chọn biểu đồ, và chỉ khi quy tắc không chọn được, AI nhận số dòng cùng tên và kiểu cột, không có giá trị. Tóm tắt bằng AI mặc định tắt. Giọng nói chỉ gửi khi người dùng tự bấm ghi âm. Bảng kết quả, mật khẩu, khóa và vai trò không bao giờ được gửi. Trước khi dùng dữ liệu thật, chúng tôi cần rà điều khoản lưu giữ của nhà cung cấp AI, phân loại dữ liệu và kiểm thử xâm nhập độc lập.</w:t>
+      </w:r>
+    </w:p>
+    <w:p>
+      <w:pPr>
+        <w:pStyle w:val="Heading2"/>
+      </w:pPr>
+      <w:r>
+        <w:t>Slide 6 · Luồng xử lý: mỗi câu hỏi đi qua năm bước kiểm soát  (~60 giây)</w:t>
       </w:r>
     </w:p>
     <w:p>
@@ -1037,7 +1153,41 @@
         <w:pStyle w:val="Heading2"/>
       </w:pPr>
       <w:r>
-        <w:t>Slide 6 · Demo: hỏi bằng tiếng Việt, nhận biểu đồ ngay  (~45 giây)</w:t>
+        <w:t>Slide 7 · Vì sao chọn cách này  (~45 giây)</w:t>
+      </w:r>
+    </w:p>
+    <w:p>
+      <w:pPr>
+        <w:spacing w:after="80" w:line="300" w:lineRule="auto"/>
+      </w:pPr>
+      <w:r>
+        <w:rPr>
+          <w:b w:val="0"/>
+          <w:i/>
+          <w:color w:val="555B66"/>
+          <w:sz w:val="20"/>
+        </w:rPr>
+        <w:t>Trên slide: Bốn quyết định kiến trúc kèm phương án đã loại: kết hợp hai đường truy vấn, AI qua API, backend kiểm soát truy cập, biểu đồ theo quy tắc.</w:t>
+      </w:r>
+    </w:p>
+    <w:p>
+      <w:pPr>
+        <w:spacing w:after="200" w:line="300" w:lineRule="auto"/>
+      </w:pPr>
+      <w:r>
+        <w:rPr>
+          <w:b w:val="0"/>
+          <w:i w:val="0"/>
+        </w:rPr>
+        <w:t>Vì sao chọn cách này, và đã loại những phương án nào. Một, kết hợp Structured Intent với RAG: câu phổ biến cho kết quả nhất quán, câu lạ vẫn được trả lời; chúng tôi đã loại việc chỉ dùng Structured Intent vì quá hẹp, và việc cho AI viết SQL tự do vì dễ sai công thức nghiệp vụ. Hai, dùng AI qua API bên ngoài để không phải vận hành mô hình; phương án máy chủ offline tốn khoảng 200 đến 500 đô la mỗi tháng và cần người vận hành, nên để dành cho trường hợp bắt buộc không để dữ liệu ra ngoài. Ba, backend kiểm soát truy cập: AI không có đường tới kho dữ liệu và SQL nào cũng bị kiểm tra; chúng tôi chưa dùng agent tự gọi công cụ vì khó kiểm thử và khó đoán số lần gọi AI, và sẽ xem lại nếu kiểm thử cho thấy cần. Bốn, biểu đồ chọn theo quy tắc trước, AI chỉ dự phòng, để kết quả dễ đoán, rẻ và kiểm tra được.</w:t>
+      </w:r>
+    </w:p>
+    <w:p>
+      <w:pPr>
+        <w:pStyle w:val="Heading2"/>
+      </w:pPr>
+      <w:r>
+        <w:t>Slide 8 · Demo: hỏi bằng tiếng Việt, nhận biểu đồ ngay  (~45 giây)</w:t>
       </w:r>
     </w:p>
     <w:p>
@@ -1063,7 +1213,7 @@
           <w:b w:val="0"/>
           <w:i w:val="0"/>
         </w:rPr>
-        <w:t>Đây là ảnh chụp từ bản demo đang chạy. Bên trái, tôi hỏi "Doanh thu theo khu vực năm 2024". Hệ thống trả lời bằng một câu tóm tắt: khu vực cao nhất, thấp nhất, tỷ trọng; và tự chọn biểu đồ cột vì đây là so sánh giữa các nhóm. Bên phải, tôi xin "theo tháng, dạng biểu đồ đường", hệ thống vẽ đúng loại biểu đồ được yêu cầu. Mọi con số trong câu tóm tắt đều lấy từ kết quả truy vấn, không do AI viết ra.</w:t>
+        <w:t>Đây là ảnh chụp từ bản demo đang chạy. Bên trái, tôi hỏi "Doanh thu theo khu vực năm 2024". Hệ thống trả lời bằng một câu tóm tắt: khu vực cao nhất, thấp nhất, tỷ trọng; và biểu đồ cột được chọn theo quy tắc của hệ thống vì đây là so sánh giữa các nhóm; AI chỉ được hỏi khi quy tắc không chọn được. Bên phải, tôi xin "theo tháng, dạng biểu đồ đường", hệ thống vẽ đúng loại biểu đồ được yêu cầu. Mọi con số trong câu tóm tắt đều lấy từ kết quả truy vấn, không do AI viết ra.</w:t>
       </w:r>
     </w:p>
     <w:p>
@@ -1071,7 +1221,7 @@
         <w:pStyle w:val="Heading2"/>
       </w:pPr>
       <w:r>
-        <w:t>Slide 7 · Demo: một tin nhắn, nhiều yêu cầu  (~35 giây)</w:t>
+        <w:t>Slide 9 · Demo: một tin nhắn, nhiều yêu cầu  (~35 giây)</w:t>
       </w:r>
     </w:p>
     <w:p>
@@ -1105,7 +1255,7 @@
         <w:pStyle w:val="Heading2"/>
       </w:pPr>
       <w:r>
-        <w:t>Slide 8 · Demo: không đoán, không vượt quyền  (~35 giây)</w:t>
+        <w:t>Slide 10 · Demo: không đoán, không vượt quyền  (~35 giây)</w:t>
       </w:r>
     </w:p>
     <w:p>
@@ -1139,7 +1289,7 @@
         <w:pStyle w:val="Heading2"/>
       </w:pPr>
       <w:r>
-        <w:t>Slide 9 · Demo: mỗi con số truy được về câu SQL đã chạy  (~30 giây)</w:t>
+        <w:t>Slide 11 · Demo: mỗi con số truy được về câu SQL đã chạy  (~30 giây)</w:t>
       </w:r>
     </w:p>
     <w:p>
@@ -1173,7 +1323,7 @@
         <w:pStyle w:val="Heading2"/>
       </w:pPr>
       <w:r>
-        <w:t>Slide 10 · Dự báo: có nhãn, có khoảng tin cậy, biết từ chối  (~50 giây)</w:t>
+        <w:t>Slide 12 · Dự báo: có nhãn, có khoảng tin cậy, biết từ chối  (~50 giây)</w:t>
       </w:r>
     </w:p>
     <w:p>
@@ -1207,7 +1357,7 @@
         <w:pStyle w:val="Heading2"/>
       </w:pPr>
       <w:r>
-        <w:t>Slide 11 · Kiểm soát: an toàn và truy vết được thiết kế từ đầu  (~50 giây)</w:t>
+        <w:t>Slide 13 · Kiểm soát: an toàn và truy vết được thiết kế từ đầu  (~50 giây)</w:t>
       </w:r>
     </w:p>
     <w:p>
@@ -1241,7 +1391,7 @@
         <w:pStyle w:val="Heading2"/>
       </w:pPr>
       <w:r>
-        <w:t>Slide 12 · Kết quả kiểm thử: số liệu được kiểm chứng ra sao  (~45 giây)</w:t>
+        <w:t>Slide 14 · Kết quả kiểm thử: số liệu được kiểm chứng ra sao  (~45 giây)</w:t>
       </w:r>
     </w:p>
     <w:p>
@@ -1275,7 +1425,7 @@
         <w:pStyle w:val="Heading2"/>
       </w:pPr>
       <w:r>
-        <w:t>Slide 13 · Giới hạn đã biết  (~50 giây)</w:t>
+        <w:t>Slide 15 · Giới hạn đã biết  (~50 giây)</w:t>
       </w:r>
     </w:p>
     <w:p>
@@ -1309,7 +1459,7 @@
         <w:pStyle w:val="Heading2"/>
       </w:pPr>
       <w:r>
-        <w:t>Slide 14 · Chi phí AI ước tính: API hay máy chủ riêng  (~40 giây)</w:t>
+        <w:t>Slide 16 · Chi phí AI ước tính: API hay máy chủ riêng  (~40 giây)</w:t>
       </w:r>
     </w:p>
     <w:p>
@@ -1343,7 +1493,7 @@
         <w:pStyle w:val="Heading2"/>
       </w:pPr>
       <w:r>
-        <w:t>Slide 15 · Rủi ro và bước tiếp theo  (~45 giây)</w:t>
+        <w:t>Slide 17 · Rủi ro và bước tiếp theo  (~45 giây)</w:t>
       </w:r>
     </w:p>
     <w:p>
@@ -1377,7 +1527,7 @@
         <w:pStyle w:val="Heading2"/>
       </w:pPr>
       <w:r>
-        <w:t>Slide 16 · Đề xuất và kết  (~20 giây)</w:t>
+        <w:t>Slide 18 · Đề xuất và kết  (~20 giây)</w:t>
       </w:r>
     </w:p>
     <w:p>

</xml_diff>

<commit_message>
Presentation script: plainer, more natural wording
</commit_message>
<xml_diff>
--- a/docs/ACBI_bai_trinh_bay.docx
+++ b/docs/ACBI_bai_trinh_bay.docx
@@ -975,7 +975,7 @@
           <w:b w:val="0"/>
           <w:i w:val="0"/>
         </w:rPr>
-        <w:t>Xin chào anh chị. Hôm nay tôi trình bày đề xuất giải pháp kỹ thuật cho ACBI: hệ thống cho phép hỏi dữ liệu kinh doanh bằng tiếng Việt, qua chat hoặc giọng nói, và nhận câu trả lời có số liệu kiểm chứng được. Phần trình bày khoảng mười hai phút, gồm phần giải pháp, phần demo trên hệ thống đang chạy và kết quả kiểm thử, sau đó là phần hỏi đáp.</w:t>
+        <w:t>Xin chào anh chị. Hôm nay tôi giới thiệu ACBI, một hệ thống cho phép hỏi dữ liệu kinh doanh bằng tiếng Việt, qua chat hoặc giọng nói, và nhận lại câu trả lời có số liệu kiểm chứng được. Phần trình bày khoảng mười hai phút, gồm giải pháp, demo trên hệ thống đang chạy và kết quả kiểm thử, sau đó là phần hỏi đáp.</w:t>
       </w:r>
     </w:p>
     <w:p>
@@ -1009,7 +1009,7 @@
           <w:b w:val="0"/>
           <w:i w:val="0"/>
         </w:rPr>
-        <w:t>Hiện nay, muốn biết doanh thu tháng này hay sản lượng của một nhà máy, người dùng phải tự mở dashboard, lọc và đối chiếu. ACBI cho phép hỏi thẳng, như hỏi một đồng nghiệp, và nhận câu trả lời kèm bảng và biểu đồ. Tài liệu đặt ra năm mục tiêu chất lượng: chính xác, bảo mật, truy vết, dễ dùng và hiệu năng. Chính xác và bảo mật được ưu tiên cao nhất: hệ thống thà nói "không đủ dữ liệu" còn hơn đưa ra một con số không có căn cứ. Mục tiêu hiệu năng 15 giây là con số tạm thời, sẽ chốt sau khi đo.</w:t>
+        <w:t>Hiện nay, muốn biết doanh thu tháng này hay sản lượng của một nhà máy, người dùng phải tự mở báo cáo, lọc và đối chiếu. ACBI cho phép hỏi thẳng, như hỏi một đồng nghiệp, và nhận câu trả lời có số liệu, bảng, biểu đồ, đúng trong phạm vi quyền của mình. Chúng tôi đặt ra năm mục tiêu: chính xác, bảo mật, xem lại được nguồn, dễ dùng và đủ nhanh. Về tốc độ, mục tiêu là 95% câu trả lời trong vòng 15 giây.</w:t>
       </w:r>
     </w:p>
     <w:p>
@@ -1043,7 +1043,7 @@
           <w:b w:val="0"/>
           <w:i w:val="0"/>
         </w:rPr>
-        <w:t>Nguyên tắc xuyên suốt của giải pháp: AI chỉ hiểu câu hỏi, còn backend quyết định dữ liệu. AI chuyển câu hỏi thành một yêu cầu có cấu trúc, hoặc đề xuất câu SQL. Nhưng kiểm tra quyền, kiểm tra SQL và tính toán con số đều do backend và cơ sở dữ liệu làm, và AI không có quyền truy cập kho dữ liệu. Nhờ vậy, kể cả khi AI hiểu sai, nó cũng không thể lấy dữ liệu ngoài quyền hay tự tạo ra số liệu.</w:t>
+        <w:t>Nguyên tắc xuyên suốt: AI chỉ giúp hiểu câu hỏi, còn quyết định lấy dữ liệu nào là việc của hệ thống. AI có thể hiểu câu hỏi hoặc gợi ý một câu lệnh truy vấn, nhưng việc kiểm tra quyền, kiểm tra câu lệnh và tính con số đều do hệ thống và cơ sở dữ liệu làm. Nhờ vậy, kể cả khi AI hiểu sai, nó cũng không thể lấy dữ liệu ngoài quyền hay tự bịa ra số liệu.</w:t>
       </w:r>
     </w:p>
     <w:p>
@@ -1077,7 +1077,7 @@
           <w:b w:val="0"/>
           <w:i w:val="0"/>
         </w:rPr>
-        <w:t>Về kiến trúc, có ba khối chính: giao diện web, backend, và lưu trữ ứng dụng. Backend chia thành các phần rõ ràng: điều phối, phân quyền, hội thoại, tích hợp AI, định nghĩa chỉ số, dựng và kiểm tra SQL, trình bày kết quả, lịch sử và nhật ký. Hai dịch vụ bên ngoài là mô hình ngôn ngữ và dịch vụ chuyển giọng nói thành văn bản, đều gọi qua kết nối mã hoá với khoá giữ trên máy chủ. Kho dữ liệu công ty được truy cập bằng tài khoản chỉ đọc; AI không có đường nào tới kho dữ liệu. Dịch vụ AI chỉ nhận câu hỏi, định nghĩa chỉ số, tên bảng và cột, vài câu SQL mẫu và, khi hỏi nối tiếp, các lượt gần nhất đã thay số tiền và tỷ lệ có định dạng bằng ký hiệu; riêng khi người dùng hỏi về chính câu trả lời vừa rồi thì văn bản câu trả lời được gửi kèm; không nhận dòng kết quả. Triển khai bằng Docker Compose với ba container: web, backend và cơ sở dữ liệu ứng dụng.</w:t>
+        <w:t>Hệ thống có ba khối chính: giao diện web, phần xử lý trung tâm viết bằng Python, và nơi lưu trữ của ứng dụng. Phần xử lý chia thành các nhóm việc rõ ràng: điều phối, phân quyền, hội thoại, kết nối AI, định nghĩa chỉ số, dựng và kiểm tra câu lệnh, trình bày kết quả, lưu lịch sử. Có hai dịch vụ bên ngoài: AI hiểu ngôn ngữ và dịch vụ chuyển giọng nói thành chữ, đều gọi qua kết nối mã hoá, khóa truy cập giữ trên máy chủ. Kho dữ liệu của công ty chỉ được đọc, và AI không có đường nào tới đó. Chính xác AI nhận gì thì tôi sẽ nói ở slide sau. Hệ thống triển khai gọn bằng ba container: web, xử lý và cơ sở dữ liệu của ứng dụng.</w:t>
       </w:r>
     </w:p>
     <w:p>
@@ -1111,7 +1111,7 @@
           <w:b w:val="0"/>
           <w:i w:val="0"/>
         </w:rPr>
-        <w:t>Câu hỏi hội đồng hay hỏi nhất: dữ liệu của chúng tôi có bị gửi ra ngoài không? Đây là toàn bộ những gì dịch vụ AI nhận được, theo từng lần gọi. Khi hiểu câu hỏi, AI nhận câu hỏi, danh mục chỉ số đã duyệt và vài lượt hội thoại gần nhất, trong đó số tiền đã được che. Khi người dùng hỏi về dữ liệu hoặc về câu trả lời vừa rồi, AI nhận thêm văn bản của câu trả lời đó, kể cả số liệu. Khi viết SQL cho câu lạ, AI nhận định nghĩa chỉ số, tên bảng và cột được phép, tối đa hai SQL mẫu. Khi chọn biểu đồ, và chỉ khi quy tắc không chọn được, AI nhận số dòng cùng tên và kiểu cột, không có giá trị. Tóm tắt bằng AI mặc định tắt. Giọng nói chỉ gửi khi người dùng tự bấm ghi âm. Bảng kết quả, mật khẩu, khóa và vai trò không bao giờ được gửi. Trước khi dùng dữ liệu thật, chúng tôi cần rà điều khoản lưu giữ của nhà cung cấp AI, phân loại dữ liệu và kiểm thử xâm nhập độc lập.</w:t>
+        <w:t>Đây là câu hội đồng hay hỏi nhất: dữ liệu của chúng tôi có bị gửi ra ngoài không? Slide này liệt kê đúng những gì dịch vụ AI nhận được, theo từng lần gọi. Khi hiểu câu hỏi, AI nhận câu hỏi, danh sách các chỉ số đã duyệt và vài lượt trò chuyện gần nhất, trong đó số tiền đã được che. Khi người dùng hỏi về dữ liệu, hoặc về câu vừa trả lời, AI nhận thêm nội dung của câu trả lời đó, kể cả số liệu. Khi cần tự viết câu lệnh cho câu hỏi lạ, AI nhận cách tính chỉ số, tên bảng và cột được phép, và tối đa hai ví dụ. Khi chọn biểu đồ, và chỉ khi quy tắc của hệ thống không chọn được, AI nhận số dòng cùng tên và kiểu cột, không có giá trị cụ thể. Tóm tắt bằng AI đang tắt mặc định. Giọng nói chỉ được gửi khi người dùng tự bấm ghi âm. Còn bảng kết quả, mật khẩu, khóa truy cập và vai trò thì không bao giờ được gửi. Trước khi dùng dữ liệu thật, chúng tôi cần xem điều khoản lưu dữ liệu của nhà cung cấp AI, phân loại mức nhạy cảm của dữ liệu và kiểm tra bảo mật độc lập.</w:t>
       </w:r>
     </w:p>
     <w:p>
@@ -1145,7 +1145,7 @@
           <w:b w:val="0"/>
           <w:i w:val="0"/>
         </w:rPr>
-        <w:t>Mỗi câu hỏi đi qua năm bước. Đầu tiên hệ thống hiểu câu hỏi, bằng AI, hoặc bằng quy tắc nếu bật tùy chọn đó hoặc khi AI đang bận; riêng vai trò IT quản trị bị từ chối ngay từ đầu. Nếu thiếu thông tin, ví dụ chưa nói kỳ nào, hệ thống hỏi lại và nhớ ngữ cảnh của cuộc trò chuyện. Thứ hai là kiểm tra quyền: yêu cầu ngoài quyền bị từ chối, ghi nhật ký, và không có truy vấn nào được chạy. Bước dựng truy vấn có hai đường. Câu hỏi phổ biến đi đường mẫu: SQL được dựng từ mẫu theo định nghĩa chỉ số đã duyệt, nên nhiều cách hỏi khác nhau vẫn cho cùng một kết quả. Câu hỏi ngoài mẫu, ví dụ theo tuần hay theo ngày, đi đường RAG Text-to-SQL: hệ thống lấy định nghĩa và ví dụ liên quan để AI đề xuất SQL; nếu SQL lệch khuôn đã duyệt, AI được sửa tối đa hai lần. Cả hai đường đều qua cùng một lớp kiểm tra SQL rồi mới chạy.</w:t>
+        <w:t>Mỗi câu hỏi đi qua năm bước. Đầu tiên, hệ thống hiểu câu hỏi, thường là nhờ AI; nếu thiếu thông tin, ví dụ chưa nói kỳ nào, hệ thống hỏi lại và nhớ cuộc trò chuyện. Riêng tài khoản IT quản trị bị chặn ngay từ đầu vì không được xem số liệu kinh doanh. Bước hai là kiểm tra quyền: ngoài quyền thì từ chối, ghi nhật ký, và không có truy vấn nào được chạy. Bước ba là soạn truy vấn, có hai đường. Câu hỏi thường gặp đi đường mẫu: câu lệnh được lập từ mẫu có sẵn theo cách tính đã duyệt, nên hỏi cách nào cũng ra cùng một kết quả. Câu hỏi lạ, ví dụ theo tuần hay theo ngày, đi đường thứ hai: hệ thống tìm định nghĩa và ví dụ liên quan để AI viết câu lệnh, và nếu lệch khuôn đã duyệt thì AI được sửa tối đa hai lần. Cả hai đường đều qua cùng một bước kiểm tra rồi mới chạy.</w:t>
       </w:r>
     </w:p>
     <w:p>
@@ -1179,7 +1179,7 @@
           <w:b w:val="0"/>
           <w:i w:val="0"/>
         </w:rPr>
-        <w:t>Vì sao chọn cách này, và đã loại những phương án nào. Một, kết hợp Structured Intent với RAG: câu phổ biến cho kết quả nhất quán, câu lạ vẫn được trả lời; chúng tôi đã loại việc chỉ dùng Structured Intent vì quá hẹp, và việc cho AI viết SQL tự do vì dễ sai công thức nghiệp vụ. Hai, dùng AI qua API bên ngoài để không phải vận hành mô hình; phương án máy chủ offline tốn khoảng 200 đến 500 đô la mỗi tháng và cần người vận hành, nên để dành cho trường hợp bắt buộc không để dữ liệu ra ngoài. Ba, backend kiểm soát truy cập: AI không có đường tới kho dữ liệu và SQL nào cũng bị kiểm tra; chúng tôi chưa dùng agent tự gọi công cụ vì khó kiểm thử và khó đoán số lần gọi AI, và sẽ xem lại nếu kiểm thử cho thấy cần. Bốn, biểu đồ chọn theo quy tắc trước, AI chỉ dự phòng, để kết quả dễ đoán, rẻ và kiểm tra được.</w:t>
+        <w:t>Slide này nói vì sao chúng tôi chọn cách làm này, và đã cân nhắc những phương án nào khác. Một, dùng cả hai đường: câu thường gặp đi đường mẫu nên kết quả luôn nhất quán, câu lạ thì để AI viết câu lệnh. Chúng tôi không chọn chỉ dùng đường mẫu vì quá hẹp, cũng không để AI viết hết vì dễ sai cách tính nghiệp vụ. Hai, thuê AI qua dịch vụ bên ngoài để không phải tự vận hành mô hình. Chạy mô hình trên máy chủ riêng tốn khoảng 200 đến 500 đô la mỗi tháng và cần người vận hành, nên chỉ nên dùng khi bắt buộc không để dữ liệu ra ngoài. Ba, hệ thống tự kiểm soát truy cập: AI không có đường tới kho dữ liệu và câu lệnh nào cũng được kiểm tra. Chúng tôi chưa cho AI tự gọi công cụ truy vấn vì khó kiểm thử và khó đoán được số lần gọi, và sẽ xem lại nếu kiểm thử cho thấy cần. Bốn, biểu đồ chọn theo quy tắc trước, AI chỉ hỗ trợ, để kết quả dễ đoán, rẻ và kiểm tra được.</w:t>
       </w:r>
     </w:p>
     <w:p>
@@ -1213,7 +1213,7 @@
           <w:b w:val="0"/>
           <w:i w:val="0"/>
         </w:rPr>
-        <w:t>Đây là ảnh chụp từ bản demo đang chạy. Bên trái, tôi hỏi "Doanh thu theo khu vực năm 2024". Hệ thống trả lời bằng một câu tóm tắt: khu vực cao nhất, thấp nhất, tỷ trọng; và biểu đồ cột được chọn theo quy tắc của hệ thống vì đây là so sánh giữa các nhóm; AI chỉ được hỏi khi quy tắc không chọn được. Bên phải, tôi xin "theo tháng, dạng biểu đồ đường", hệ thống vẽ đúng loại biểu đồ được yêu cầu. Mọi con số trong câu tóm tắt đều lấy từ kết quả truy vấn, không do AI viết ra.</w:t>
+        <w:t>Đây là ảnh chụp từ bản demo đang chạy. Bên trái, tôi hỏi "Doanh thu theo khu vực năm 2024". Hệ thống trả lời bằng một câu tóm tắt: khu vực cao nhất, thấp nhất, chiếm bao nhiêu phần trăm, kèm biểu đồ cột vì đây là so sánh giữa các nhóm. Hệ thống chọn loại biểu đồ theo hình dạng của kết quả, AI chỉ được nhờ khi cách đó không chọn được. Bên phải, tôi xin "theo tháng, dạng biểu đồ đường" và hệ thống vẽ đúng như yêu cầu. Mọi con số trong câu tóm tắt đều lấy từ kết quả truy vấn, AI không tự viết số.</w:t>
       </w:r>
     </w:p>
     <w:p>
@@ -1247,7 +1247,7 @@
           <w:b w:val="0"/>
           <w:i w:val="0"/>
         </w:rPr>
-        <w:t>Người dùng thường hỏi nhiều thứ trong một câu. Ở đây tôi hỏi "doanh thu quý trước, rồi sản lượng của Factory A tháng trước". Hệ thống tách thành hai yêu cầu, trả lời lần lượt, mỗi phần có số liệu và nguồn riêng. Hệ thống cũng nhớ ngữ cảnh: sau một câu trả lời, người dùng chỉ cần hỏi "còn Pháp thì sao" hoặc "thêm 3 tháng nữa", không phải nhắc lại chỉ số.</w:t>
+        <w:t>Người dùng hay hỏi nhiều thứ trong một câu. Ở đây tôi hỏi "doanh thu quý trước, rồi sản lượng của Factory A tháng trước". Hệ thống tách thành hai việc và trả lời lần lượt, mỗi phần có số liệu và nguồn riêng. Hệ thống cũng nhớ cuộc trò chuyện: sau một câu trả lời, người dùng chỉ cần hỏi "còn Pháp thì sao" hay "còn năm ngoái thì sao", không phải nhắc lại chỉ số.</w:t>
       </w:r>
     </w:p>
     <w:p>
@@ -1281,7 +1281,7 @@
           <w:b w:val="0"/>
           <w:i w:val="0"/>
         </w:rPr>
-        <w:t>Hai hành vi quan trọng nhất cho độ tin cậy. Thứ nhất, câu hỏi mơ hồ như "cho tôi xem số liệu" không bị đoán: hệ thống hỏi lại chỉ số nào. Thứ hai, quyền truy cập: tôi đăng nhập bằng tài khoản kinh doanh và hỏi sản lượng nhà máy. Hệ thống từ chối, ghi vào nhật ký, và không có câu SQL nào được chạy.</w:t>
+        <w:t>Hai hành vi quan trọng nhất cho độ tin cậy. Thứ nhất, câu hỏi mơ hồ như "cho tôi xem số liệu" không bị đoán bừa: hệ thống hỏi lại bạn muốn xem chỉ số nào. Thứ hai là quyền truy cập: tôi đăng nhập bằng tài khoản kinh doanh rồi hỏi sản lượng nhà máy. Hệ thống từ chối, ghi vào nhật ký, và không có truy vấn nào được chạy.</w:t>
       </w:r>
     </w:p>
     <w:p>
@@ -1315,7 +1315,7 @@
           <w:b w:val="0"/>
           <w:i w:val="0"/>
         </w:rPr>
-        <w:t>Mỗi câu trả lời đều có phần "Nguồn dữ liệu và cách tính". Ở đây là câu "Doanh thu của Canada năm 2023": người dùng thấy ngày tham chiếu, khoảng thời gian truy vấn, câu SQL đã chạy và các tham số. Giá trị người dùng nhập, như "Canada", luôn được truyền dạng tham số, không ghép thẳng vào câu SQL, nên không thể chèn lệnh. Kết quả và nguồn được lưu lại để xem lại sau.</w:t>
+        <w:t>Mỗi câu trả lời đều có phần "Nguồn dữ liệu và cách tính". Ở đây là câu "Doanh thu của Canada năm 2023": người dùng thấy ngày tham chiếu, khoảng thời gian truy vấn, câu lệnh đã chạy và các giá trị đã dùng. Giá trị người dùng nhập, như "Canada", luôn được truyền riêng chứ không ghép thẳng vào câu lệnh, nên không thể chèn lệnh độc hại. Kết quả và nguồn được lưu lại để xem lại sau.</w:t>
       </w:r>
     </w:p>
     <w:p>
@@ -1349,7 +1349,7 @@
           <w:b w:val="0"/>
           <w:i w:val="0"/>
         </w:rPr>
-        <w:t>Hệ thống còn dự báo được doanh thu và sản lượng. Dự báo dùng phương pháp làm trơn hàm mũ, đúng phương pháp của gói forecast trong R và thư viện statsmodels, chọn mô hình theo tiêu chí AICc; tôi đã đối chiếu và kết quả khớp statsmodels. Câu trả lời luôn mở đầu bằng "Dự báo, không phải số liệu đã ghi nhận", kèm khoảng tin cậy 95% và sai số kiểm thử. Quan trọng nhất: hệ thống thử dự báo lại 6 tháng gần nhất; nếu lệch quá 35% thì từ chối, không đưa ra con số. Trên dữ liệu mẫu, vài khu vực như Pháp, Canada bị từ chối vì lý do này. Chúng tôi cũng thử lùi dần nhiều mốc trên dữ liệu mẫu và so với phương pháp đơn giản như lấy tháng trước hoặc trung bình ba tháng: sai số khoảng 18 đến 26 phần trăm, tương đương các phương pháp đó. Vì vậy dự báo luôn kèm sai số và có cơ chế từ chối, và chúng tôi không quảng bá độ chính xác của nó. Lưu ý: tháng 05/2025 của dữ liệu mẫu gần như trống, nên đường dự báo ở đây thấp hơn các tháng trước. Đây là chức năng tạm thời: phạm vi dự báo phụ thuộc nghiệp vụ nên chưa đưa vào tài liệu giải pháp v1.1.</w:t>
+        <w:t>Hệ thống còn dự báo được doanh thu và sản lượng. Dự báo dùng phương pháp làm trơn hàm mũ, giống gói forecast của R và thư viện statsmodels; tôi đã đối chiếu và kết quả khớp với statsmodels. Câu trả lời luôn mở đầu bằng "Dự báo, không phải số liệu đã ghi nhận", kèm khoảng dao động 95% và mức sai số khi thử lại. Quan trọng nhất: hệ thống thử dự báo lại 6 tháng gần nhất, nếu lệch quá 35% thì từ chối, không đưa ra con số. Trên dữ liệu mẫu, một vài khu vực như Pháp, Canada bị từ chối vì lý do này. Chúng tôi cũng thử lùi dần nhiều mốc và so với cách tính đơn giản như lấy tháng trước hoặc trung bình ba tháng: sai số khoảng 18 đến 26 phần trăm, ngang với các cách đó. Vì vậy dự báo luôn kèm sai số và có cơ chế từ chối, và chúng tôi không quảng bá độ chính xác của nó. Đây là chức năng tạm thời, phạm vi dự báo còn phụ thuộc nghiệp vụ. Lưu ý: tháng 5 năm 2025 của dữ liệu mẫu gần như trống nên đường dự báo thấp hơn các tháng trước.</w:t>
       </w:r>
     </w:p>
     <w:p>
@@ -1383,7 +1383,7 @@
           <w:b w:val="0"/>
           <w:i w:val="0"/>
         </w:rPr>
-        <w:t>Có bốn cơ chế kiểm soát. Một, phân quyền theo vai trò: quản lý xem tất cả, kinh doanh chỉ xem doanh thu, sản xuất chỉ xem nhà máy của mình, còn IT quản trị người dùng nhưng không xem số liệu kinh doanh. Hai, một lớp kiểm tra SQL dùng chung cho cả hai đường: chỉ cho phép SELECT trên bảng được phép, giá trị người dùng nhập luôn truyền dạng tham số, chạy trong giao dịch chỉ đọc có giới hạn thời gian và số dòng. Ba, không bịa số liệu: hệ thống phân biệt "không có dữ liệu", "bằng không" và "lỗi kỹ thuật"; dự báo luôn ghi rõ là dự báo và bị từ chối khi kiểm thử cho thấy không đáng tin. Bốn, mỗi câu trả lời lưu kèm SQL, tham số, thời điểm và phiên bản định nghĩa, để có thể kiểm chứng lại bất cứ lúc nào.</w:t>
+        <w:t>Có bốn cơ chế kiểm soát. Một, phân quyền theo vai trò: quản lý xem được tất cả, kinh doanh chỉ xem doanh thu, sản xuất chỉ xem nhà máy của mình, còn IT quản lý tài khoản nhưng không xem số liệu kinh doanh. Hai, một lớp kiểm tra chung cho cả hai đường: chỉ cho phép đọc dữ liệu từ các bảng được phép, giá trị người dùng nhập luôn được truyền riêng, chạy ở chế độ chỉ đọc, có giới hạn thời gian và số dòng. Ba, không bịa số liệu: hệ thống phân biệt rõ "không có dữ liệu", "bằng không" và "lỗi kỹ thuật"; dự báo luôn ghi rõ là dự báo và bị từ chối khi thử lại cho thấy không đáng tin. Bốn, mỗi câu trả lời được lưu kèm câu lệnh đã chạy, các giá trị đã dùng, thời điểm lấy dữ liệu và phiên bản cách tính, để có thể kiểm chứng lại bất cứ lúc nào.</w:t>
       </w:r>
     </w:p>
     <w:p>
@@ -1417,7 +1417,7 @@
           <w:b w:val="0"/>
           <w:i w:val="0"/>
         </w:rPr>
-        <w:t>Về kiểm thử: chúng tôi chạy ba bộ câu hỏi trên bản demo với AI thật, tổng cộng 161 ca, và mỗi con số trả về được đối chiếu độc lập với kho dữ liệu bằng một câu SQL chỉ đọc. Bộ thứ nhất, 24 câu cần đường sinh SQL từ tài liệu: theo tuần, theo ngày, theo nhà máy và theo vai trò, đạt 24 trên 24. Bộ thứ hai, 90 câu hỏi khó gồm bẫy ảo giác, câu nhiều ràng buộc và đủ bốn vai trò, đạt 90 trên 90. Bộ thứ ba, 47 câu so sánh và tin nhắn nhiều yêu cầu, đạt 47 trên 47. Ở lượt chạy đầu có 12 ca báo AI bận vì gói AI miễn phí; chúng tôi chạy lại các ca đó cho đến khi không còn báo bận và đều đạt. Những ca sai vì lý do khác sẽ tính là sai và không được chạy lại để đổi kết quả. Bằng chứng từng ca, gồm câu hỏi, câu trả lời, câu SQL đối chiếu và ảnh chụp trình duyệt, nằm trong file Excel kèm theo. Ngoài ra, 48 ca phân quyền chạy đủ bốn vai trò trên cả đường mẫu và đường sinh SQL, đều đạt: không có dữ liệu ngoài quyền nào lọt ra, và tài khoản sản xuất chỉ thấy số liệu Factory A khớp kho dữ liệu. Còn 287 kiểm thử tự động cho phần logic.</w:t>
+        <w:t>Về kiểm thử: chúng tôi chạy ba bộ câu hỏi trên bản demo, dùng AI thật, tổng cộng 161 câu. Mỗi con số trả về đều được tính lại độc lập từ kho dữ liệu bằng một câu lệnh riêng, chỉ đọc, không dùng lại phần dựng câu lệnh của ứng dụng. Bộ thứ nhất có 24 câu cần AI tự viết câu lệnh, như theo tuần, theo ngày, theo nhà máy, theo vai trò: đạt 24 trên 24. Bộ thứ hai có 90 câu hỏi khó, gồm câu bẫy, câu nhiều điều kiện và đủ bốn vai trò: đạt 90 trên 90. Bộ thứ ba có 47 câu so sánh và tin nhắn nhiều yêu cầu: đạt 47 trên 47. Có 154 bảng số liệu được so từng giá trị với kho dữ liệu và đều khớp; một số ít loại kết quả như theo sản phẩm hay ngành hàng thì chỉ kiểm tra trạng thái và nội dung. Lượt chạy đầu có 12 câu bị báo AI bận vì gói AI miễn phí; chúng tôi chạy lại đến khi hết báo bận và đều đạt. Câu sai vì lý do khác thì tính là sai, không chạy lại để đổi kết quả. Ngoài ra, 48 ca phân quyền chạy đủ bốn vai trò, trên cả hai đường, đều đạt: không có dữ liệu ngoài quyền nào lọt ra. Cuối cùng là 287 kiểm thử tự động cho phần logic. Bằng chứng từng ca, gồm câu hỏi, câu trả lời, câu lệnh đối chiếu và ảnh chụp, nằm trong file Excel kèm theo.</w:t>
       </w:r>
     </w:p>
     <w:p>
@@ -1451,7 +1451,7 @@
           <w:b w:val="0"/>
           <w:i w:val="0"/>
         </w:rPr>
-        <w:t>Tôi muốn nói trước những giới hạn đã biết. Một, hiệu năng: khi đo với năm người dùng cùng lúc, chỉ 39 trên 60 câu được trả lời, tức 65%, và 63% hoàn tất dưới 15 giây, trong khi mục tiêu là 95%. Lần đo trước đó là 34 trên 60. Mọi lỗi đều do nhà cung cấp AI miễn phí trả mã giới hạn tốc độ, không phải do kiến trúc; các câu không cần AI trả lời trong khoảng 0,3 giây. Cùng nguyên nhân đó, khi chạy 161 ca kiểm thử, 12 ca báo AI bận ở lượt đầu; chúng tôi chạy lại và đều đạt. Hai, đây là dữ liệu mẫu: bảng gán nhà máy là giả lập nên Factory C không có sản lượng, và tháng 05/2025 gần như trống. Ba, AI không ổn định tuyệt đối: cùng một câu có thể được hiểu khác giữa các lần chạy, và chúng tôi chưa đo điều này một cách hệ thống qua nhiều lần chạy. Bốn, giọng nói trong môi trường thật, giao diện điện thoại và kiểm thử xâm nhập chưa được thực hiện.</w:t>
+        <w:t>Tôi muốn nói trước những giới hạn đã biết. Một là tốc độ: thử với năm người dùng cùng lúc, chỉ 39 trên 60 câu được trả lời, tức 65%, và 63% xong trong 15 giây, trong khi mục tiêu là 95%. Lần đo trước là 34 trên 60. Mọi lỗi đều do gói AI miễn phí giới hạn tốc độ chứ không phải do kiến trúc; những câu không cần AI trả lời trong khoảng 0,3 giây. Cùng nguyên nhân đó, khi chạy 161 câu kiểm thử, 12 câu bị báo AI bận ở lượt đầu; chúng tôi chạy lại và đều đạt. Hai là dữ liệu mẫu: bảng nhà máy là giả lập nên Factory C không có sản lượng, và tháng 5 năm 2025 gần như trống. Ba là AI không ổn định tuyệt đối: cùng một câu có thể được hiểu khác nhau giữa các lần hỏi, và chúng tôi chưa đo điều này một cách bài bản. Bốn là những phần chưa kiểm tra: giọng nói trong môi trường thật, giao diện điện thoại và kiểm tra bảo mật độc lập.</w:t>
       </w:r>
     </w:p>
     <w:p>
@@ -1485,7 +1485,7 @@
           <w:b w:val="0"/>
           <w:i w:val="0"/>
         </w:rPr>
-        <w:t>Về chi phí, có hai hướng. Hướng thứ nhất là dùng API Claude. Với mô hình Haiku 5.5, chi phí khoảng 16 đô la mỗi tháng cho 20.000 câu hỏi, và đó là tính trong kịch bản xấu nhất khi mọi câu đều phải gọi AI; khi bật tùy chọn đọc câu bằng quy tắc, như trên bản demo, nhiều câu rõ ràng không cần gọi AI; tùy chọn này mặc định tắt. Sonnet đắt hơn khoảng 20 lần, chỉ dùng nếu Haiku chưa đủ chất lượng. Hướng thứ hai là thuê hoặc mua máy chủ GPU để chạy mô hình offline: khoảng 200 đến 500 đô la mỗi tháng, cố định, chưa tính người vận hành, nhưng dữ liệu không ra khỏi công ty. Điểm hòa vốn khoảng 250.000 đến 630.000 câu mỗi tháng tùy giá máy chủ, nên với quy mô thí điểm, API rẻ hơn nhiều. Xin lưu ý đây là ước tính: chúng tôi chưa chạy bộ kiểm thử trên Claude, và chi phí nhân sự chưa được điền.</w:t>
+        <w:t>Về chi phí có hai hướng. Hướng thứ nhất là dùng API của Claude. Với mô hình Haiku 5.5, chi phí khoảng 16 đô la mỗi tháng cho 20.000 câu hỏi, và đó là tính trong trường hợp xấu nhất, khi câu nào cũng phải nhờ AI. Nếu bật tùy chọn để hệ thống tự đọc những câu đơn giản, như bản demo đang làm, thì nhiều câu không cần gọi AI; tùy chọn này mặc định đang tắt. Mô hình mạnh hơn là Sonnet đắt gấp khoảng 20 lần, chỉ dùng nếu Haiku chưa đủ tốt. Hướng thứ hai là thuê hoặc mua máy chủ GPU để chạy mô hình AI ngay trong công ty: khoảng 200 đến 500 đô la mỗi tháng, cố định, chưa tính người vận hành, nhưng dữ liệu không ra khỏi công ty. Máy chủ riêng chỉ rẻ hơn khi có khoảng 250.000 đến 630.000 câu mỗi tháng tùy giá máy chủ, nên với quy mô thí điểm, dùng API rẻ hơn nhiều. Xin lưu ý đây là ước tính: chúng tôi chưa chạy bộ kiểm thử trên Claude và chi phí nhân sự chưa được điền.</w:t>
       </w:r>
     </w:p>
     <w:p>
@@ -1519,7 +1519,7 @@
           <w:b w:val="0"/>
           <w:i w:val="0"/>
         </w:rPr>
-        <w:t>Bốn rủi ro chính đã được nêu trong tài liệu cùng cách giảm thiểu: kết quả sai dù SQL vẫn chạy được, lộ dữ liệu ngoài quyền, phụ thuộc vào dịch vụ AI bên ngoài, và phạm vi kiểm thử còn hẹp. Bước tiếp theo, tôi đề xuất năm việc: chuyển sang gói AI trả phí rồi đo lại tải, vì kết quả đo hôm nay bị giới hạn bởi quota miễn phí; chốt định nghĩa chỉ số và phân quyền cùng các phòng ban; xây bộ 100 đến 200 câu hỏi thật và chạy nhiều lần để đo độ ổn định; chạy thử với dữ liệu thật của công ty; và tài liệu đã được cập nhật lên bản 1.1 với dữ liệu gửi cho AI, cách chọn biểu đồ và ước tính chi phí; chức năng dự báo chưa đưa vào tài liệu vì còn phụ thuộc nghiệp vụ. Ở bản vận hành chúng tôi dùng một nhà cung cấp trả phí hoặc mô hình offline; việc xoay vòng nhiều nhà cung cấp miễn phí chỉ là phương án tạm cho giai đoạn demo.</w:t>
+        <w:t>Có bốn rủi ro chính, đã nêu trong tài liệu cùng cách giảm thiểu: số liệu sai dù câu lệnh vẫn chạy được, lộ dữ liệu ngoài quyền, phụ thuộc vào dịch vụ AI bên ngoài, và phạm vi kiểm thử còn hẹp. Bước tiếp theo tôi đề xuất năm việc. Một, chuyển sang gói AI trả phí rồi đo lại tốc độ, vì kết quả hôm nay bị giới hạn bởi gói miễn phí. Hai, cùng các phòng ban chốt cách tính chỉ số và quyền xem. Ba, xây bộ 100 đến 200 câu hỏi thật và chạy nhiều lần để đo độ ổn định. Bốn, chạy thử với dữ liệu thật của công ty. Năm, tài liệu giải pháp đã được cập nhật lên bản 1.1; riêng phần dự báo chưa đưa vào vì còn phụ thuộc nghiệp vụ. Ở bản chính thức, chúng tôi dùng một nhà cung cấp AI trả phí hoặc mô hình chạy trong công ty; việc luân phiên nhiều AI miễn phí chỉ là cách tạm cho giai đoạn demo.</w:t>
       </w:r>
     </w:p>
     <w:p>
@@ -1553,7 +1553,7 @@
           <w:b w:val="0"/>
           <w:i w:val="0"/>
         </w:rPr>
-        <w:t>Tóm lại, tôi đề xuất duyệt kiến trúc này và chạy thử với dữ liệu thật của công ty. Nền tảng đã chứng minh được trên dữ liệu mẫu: hiểu câu hỏi tiếng Việt, trả lời đúng quyền, và luôn có nguồn để kiểm chứng. Cảm ơn anh chị đã lắng nghe, tôi sẵn sàng trả lời câu hỏi.</w:t>
+        <w:t>Tóm lại, tôi đề xuất duyệt kiến trúc này và chạy thử với dữ liệu thật của công ty. Trên dữ liệu mẫu, hệ thống đã cho thấy khả năng hiểu câu hỏi tiếng Việt, trả lời đúng quyền, và luôn có nguồn để kiểm chứng. Cảm ơn anh chị đã lắng nghe, tôi sẵn sàng trả lời câu hỏi.</w:t>
       </w:r>
     </w:p>
     <w:p>

</xml_diff>

<commit_message>
Presentation script: drop the flow slide, fold its speech into the previous slide
</commit_message>
<xml_diff>
--- a/docs/ACBI_bai_trinh_bay.docx
+++ b/docs/ACBI_bai_trinh_bay.docx
@@ -57,7 +57,7 @@
           <w:b w:val="0"/>
           <w:i w:val="0"/>
         </w:rPr>
-        <w:t>Bài gồm 18 slide, thời lượng nói khoảng 12 phút 40 giây, chưa tính hỏi đáp. Mỗi slide có phần chữ trên slide (để nhớ ý) và phần lời nói đầy đủ để đọc hoặc nói theo.</w:t>
+        <w:t>Bài gồm 17 slide, thời lượng nói khoảng 11 phút 40 giây, chưa tính hỏi đáp. Mỗi slide có phần chữ trên slide (để nhớ ý) và phần lời nói đầy đủ để đọc hoặc nói theo.</w:t>
       </w:r>
     </w:p>
     <w:p>
@@ -377,7 +377,7 @@
               <w:rPr>
                 <w:sz w:val="20"/>
               </w:rPr>
-              <w:t>Luồng xử lý: mỗi câu hỏi đi qua năm bước kiểm soát</w:t>
+              <w:t>Vì sao chọn cách này</w:t>
             </w:r>
           </w:p>
         </w:tc>
@@ -390,7 +390,7 @@
               <w:rPr>
                 <w:sz w:val="20"/>
               </w:rPr>
-              <w:t>60 giây</w:t>
+              <w:t>45 giây</w:t>
             </w:r>
           </w:p>
         </w:tc>
@@ -418,7 +418,7 @@
               <w:rPr>
                 <w:sz w:val="20"/>
               </w:rPr>
-              <w:t>Vì sao chọn cách này</w:t>
+              <w:t>Demo: hỏi bằng tiếng Việt, nhận biểu đồ ngay</w:t>
             </w:r>
           </w:p>
         </w:tc>
@@ -459,7 +459,7 @@
               <w:rPr>
                 <w:sz w:val="20"/>
               </w:rPr>
-              <w:t>Demo: hỏi bằng tiếng Việt, nhận biểu đồ ngay</w:t>
+              <w:t>Demo: một tin nhắn, nhiều yêu cầu</w:t>
             </w:r>
           </w:p>
         </w:tc>
@@ -472,7 +472,7 @@
               <w:rPr>
                 <w:sz w:val="20"/>
               </w:rPr>
-              <w:t>45 giây</w:t>
+              <w:t>35 giây</w:t>
             </w:r>
           </w:p>
         </w:tc>
@@ -500,7 +500,7 @@
               <w:rPr>
                 <w:sz w:val="20"/>
               </w:rPr>
-              <w:t>Demo: một tin nhắn, nhiều yêu cầu</w:t>
+              <w:t>Demo: không đoán, không vượt quyền</w:t>
             </w:r>
           </w:p>
         </w:tc>
@@ -541,47 +541,6 @@
               <w:rPr>
                 <w:sz w:val="20"/>
               </w:rPr>
-              <w:t>Demo: không đoán, không vượt quyền</w:t>
-            </w:r>
-          </w:p>
-        </w:tc>
-        <w:tc>
-          <w:tcPr>
-            <w:tcW w:type="dxa" w:w="1928"/>
-          </w:tcPr>
-          <w:p>
-            <w:r>
-              <w:rPr>
-                <w:sz w:val="20"/>
-              </w:rPr>
-              <w:t>35 giây</w:t>
-            </w:r>
-          </w:p>
-        </w:tc>
-      </w:tr>
-      <w:tr>
-        <w:tc>
-          <w:tcPr>
-            <w:tcW w:type="dxa" w:w="907"/>
-          </w:tcPr>
-          <w:p>
-            <w:r>
-              <w:rPr>
-                <w:sz w:val="20"/>
-              </w:rPr>
-              <w:t>11</w:t>
-            </w:r>
-          </w:p>
-        </w:tc>
-        <w:tc>
-          <w:tcPr>
-            <w:tcW w:type="dxa" w:w="6576"/>
-          </w:tcPr>
-          <w:p>
-            <w:r>
-              <w:rPr>
-                <w:sz w:val="20"/>
-              </w:rPr>
               <w:t>Demo: mỗi con số truy được về câu SQL đã chạy</w:t>
             </w:r>
           </w:p>
@@ -610,7 +569,7 @@
               <w:rPr>
                 <w:sz w:val="20"/>
               </w:rPr>
-              <w:t>12</w:t>
+              <w:t>11</w:t>
             </w:r>
           </w:p>
         </w:tc>
@@ -651,7 +610,7 @@
               <w:rPr>
                 <w:sz w:val="20"/>
               </w:rPr>
-              <w:t>13</w:t>
+              <w:t>12</w:t>
             </w:r>
           </w:p>
         </w:tc>
@@ -692,7 +651,7 @@
               <w:rPr>
                 <w:sz w:val="20"/>
               </w:rPr>
-              <w:t>14</w:t>
+              <w:t>13</w:t>
             </w:r>
           </w:p>
         </w:tc>
@@ -733,7 +692,7 @@
               <w:rPr>
                 <w:sz w:val="20"/>
               </w:rPr>
-              <w:t>15</w:t>
+              <w:t>14</w:t>
             </w:r>
           </w:p>
         </w:tc>
@@ -774,7 +733,7 @@
               <w:rPr>
                 <w:sz w:val="20"/>
               </w:rPr>
-              <w:t>16</w:t>
+              <w:t>15</w:t>
             </w:r>
           </w:p>
         </w:tc>
@@ -815,7 +774,7 @@
               <w:rPr>
                 <w:sz w:val="20"/>
               </w:rPr>
-              <w:t>17</w:t>
+              <w:t>16</w:t>
             </w:r>
           </w:p>
         </w:tc>
@@ -856,7 +815,7 @@
               <w:rPr>
                 <w:sz w:val="20"/>
               </w:rPr>
-              <w:t>18</w:t>
+              <w:t>17</w:t>
             </w:r>
           </w:p>
         </w:tc>
@@ -925,7 +884,7 @@
                 <w:b/>
                 <w:sz w:val="20"/>
               </w:rPr>
-              <w:t>12 phút 40 giây</w:t>
+              <w:t>11 phút 40 giây</w:t>
             </w:r>
           </w:p>
         </w:tc>
@@ -1111,7 +1070,7 @@
           <w:b w:val="0"/>
           <w:i w:val="0"/>
         </w:rPr>
-        <w:t>Đây là câu hội đồng hay hỏi nhất: dữ liệu của chúng tôi có bị gửi ra ngoài không? Slide này liệt kê đúng những gì dịch vụ AI nhận được, theo từng lần gọi. Khi hiểu câu hỏi, AI nhận câu hỏi, danh sách các chỉ số đã duyệt và vài lượt trò chuyện gần nhất, trong đó số tiền đã được che. Khi người dùng hỏi về dữ liệu, hoặc về câu vừa trả lời, AI nhận thêm nội dung của câu trả lời đó, kể cả số liệu. Khi cần tự viết câu lệnh cho câu hỏi lạ, AI nhận cách tính chỉ số, tên bảng và cột được phép, và tối đa hai ví dụ. Khi chọn biểu đồ, và chỉ khi quy tắc của hệ thống không chọn được, AI nhận số dòng cùng tên và kiểu cột, không có giá trị cụ thể. Tóm tắt bằng AI đang tắt mặc định. Giọng nói chỉ được gửi khi người dùng tự bấm ghi âm. Còn bảng kết quả, mật khẩu, khóa truy cập và vai trò thì không bao giờ được gửi. Trước khi dùng dữ liệu thật, chúng tôi cần xem điều khoản lưu dữ liệu của nhà cung cấp AI, phân loại mức nhạy cảm của dữ liệu và kiểm tra bảo mật độc lập.</w:t>
+        <w:t>Mỗi câu hỏi đi qua năm bước: hiểu câu hỏi, kiểm tra quyền, soạn truy vấn, kiểm tra câu lệnh, rồi chạy và trả lời. Ở bước đầu, hệ thống hiểu câu hỏi; nếu thiếu thông tin, ví dụ chưa nói kỳ nào, thì hỏi lại và nhớ cuộc trò chuyện. Tài khoản IT quản trị bị chặn ngay từ đầu vì không được xem số liệu kinh doanh. Bước hai là kiểm tra quyền: ngoài quyền thì từ chối, ghi nhật ký, và không có truy vấn nào được chạy. Bước ba có hai đường. Câu hỏi thường gặp đi đường mẫu: câu lệnh được lập từ mẫu có sẵn theo cách tính đã duyệt, nên hỏi cách nào cũng ra cùng một kết quả. Câu hỏi lạ, ví dụ theo tuần hay theo ngày, đi đường AI tự viết: hệ thống tìm định nghĩa và ví dụ liên quan để AI viết câu lệnh, và nếu lệch khuôn đã duyệt thì AI được sửa tối đa hai lần. Cả hai đường đều qua cùng một bước kiểm tra rồi mới chạy. Vậy trong các bước đó, dịch vụ AI nhận được gì? Đây là câu hội đồng hay hỏi nhất: dữ liệu của chúng tôi có bị gửi ra ngoài không? Slide này liệt kê đúng những gì dịch vụ AI nhận được, theo từng lần gọi. Khi hiểu câu hỏi, AI nhận câu hỏi, danh sách các chỉ số đã duyệt và vài lượt trò chuyện gần nhất, trong đó số tiền đã được che. Khi người dùng hỏi về dữ liệu, hoặc về câu vừa trả lời, AI nhận thêm nội dung của câu trả lời đó, kể cả số liệu. Khi cần tự viết câu lệnh cho câu hỏi lạ, AI nhận cách tính chỉ số, tên bảng và cột được phép, và tối đa hai ví dụ. Khi chọn biểu đồ, và chỉ khi quy tắc của hệ thống không chọn được, AI nhận số dòng cùng tên và kiểu cột, không có giá trị cụ thể. Tóm tắt bằng AI đang tắt mặc định. Giọng nói chỉ được gửi khi người dùng tự bấm ghi âm. Còn bảng kết quả, mật khẩu, khóa truy cập và vai trò thì không bao giờ được gửi. Trước khi dùng dữ liệu thật, chúng tôi cần xem điều khoản lưu dữ liệu của nhà cung cấp AI, phân loại mức nhạy cảm của dữ liệu và kiểm tra bảo mật độc lập.</w:t>
       </w:r>
     </w:p>
     <w:p>
@@ -1119,41 +1078,7 @@
         <w:pStyle w:val="Heading2"/>
       </w:pPr>
       <w:r>
-        <w:t>Slide 6 · Luồng xử lý: mỗi câu hỏi đi qua năm bước kiểm soát  (~60 giây)</w:t>
-      </w:r>
-    </w:p>
-    <w:p>
-      <w:pPr>
-        <w:spacing w:after="80" w:line="300" w:lineRule="auto"/>
-      </w:pPr>
-      <w:r>
-        <w:rPr>
-          <w:b w:val="0"/>
-          <w:i/>
-          <w:color w:val="555B66"/>
-          <w:sz w:val="20"/>
-        </w:rPr>
-        <w:t>Trên slide: Hiểu câu hỏi, kiểm tra quyền, dựng truy vấn, kiểm tra SQL, chạy và trả lời. Hai đường: câu phổ biến dựng từ mẫu, câu ngoài mẫu qua RAG Text-to-SQL.</w:t>
-      </w:r>
-    </w:p>
-    <w:p>
-      <w:pPr>
-        <w:spacing w:after="200" w:line="300" w:lineRule="auto"/>
-      </w:pPr>
-      <w:r>
-        <w:rPr>
-          <w:b w:val="0"/>
-          <w:i w:val="0"/>
-        </w:rPr>
-        <w:t>Mỗi câu hỏi đi qua năm bước. Đầu tiên, hệ thống hiểu câu hỏi, thường là nhờ AI; nếu thiếu thông tin, ví dụ chưa nói kỳ nào, hệ thống hỏi lại và nhớ cuộc trò chuyện. Riêng tài khoản IT quản trị bị chặn ngay từ đầu vì không được xem số liệu kinh doanh. Bước hai là kiểm tra quyền: ngoài quyền thì từ chối, ghi nhật ký, và không có truy vấn nào được chạy. Bước ba là soạn truy vấn, có hai đường. Câu hỏi thường gặp đi đường mẫu: câu lệnh được lập từ mẫu có sẵn theo cách tính đã duyệt, nên hỏi cách nào cũng ra cùng một kết quả. Câu hỏi lạ, ví dụ theo tuần hay theo ngày, đi đường thứ hai: hệ thống tìm định nghĩa và ví dụ liên quan để AI viết câu lệnh, và nếu lệch khuôn đã duyệt thì AI được sửa tối đa hai lần. Cả hai đường đều qua cùng một bước kiểm tra rồi mới chạy.</w:t>
-      </w:r>
-    </w:p>
-    <w:p>
-      <w:pPr>
-        <w:pStyle w:val="Heading2"/>
-      </w:pPr>
-      <w:r>
-        <w:t>Slide 7 · Vì sao chọn cách này  (~45 giây)</w:t>
+        <w:t>Slide 6 · Vì sao chọn cách này  (~45 giây)</w:t>
       </w:r>
     </w:p>
     <w:p>
@@ -1187,7 +1112,7 @@
         <w:pStyle w:val="Heading2"/>
       </w:pPr>
       <w:r>
-        <w:t>Slide 8 · Demo: hỏi bằng tiếng Việt, nhận biểu đồ ngay  (~45 giây)</w:t>
+        <w:t>Slide 7 · Demo: hỏi bằng tiếng Việt, nhận biểu đồ ngay  (~45 giây)</w:t>
       </w:r>
     </w:p>
     <w:p>
@@ -1221,7 +1146,7 @@
         <w:pStyle w:val="Heading2"/>
       </w:pPr>
       <w:r>
-        <w:t>Slide 9 · Demo: một tin nhắn, nhiều yêu cầu  (~35 giây)</w:t>
+        <w:t>Slide 8 · Demo: một tin nhắn, nhiều yêu cầu  (~35 giây)</w:t>
       </w:r>
     </w:p>
     <w:p>
@@ -1255,7 +1180,7 @@
         <w:pStyle w:val="Heading2"/>
       </w:pPr>
       <w:r>
-        <w:t>Slide 10 · Demo: không đoán, không vượt quyền  (~35 giây)</w:t>
+        <w:t>Slide 9 · Demo: không đoán, không vượt quyền  (~35 giây)</w:t>
       </w:r>
     </w:p>
     <w:p>
@@ -1289,7 +1214,7 @@
         <w:pStyle w:val="Heading2"/>
       </w:pPr>
       <w:r>
-        <w:t>Slide 11 · Demo: mỗi con số truy được về câu SQL đã chạy  (~30 giây)</w:t>
+        <w:t>Slide 10 · Demo: mỗi con số truy được về câu SQL đã chạy  (~30 giây)</w:t>
       </w:r>
     </w:p>
     <w:p>
@@ -1323,7 +1248,7 @@
         <w:pStyle w:val="Heading2"/>
       </w:pPr>
       <w:r>
-        <w:t>Slide 12 · Dự báo: có nhãn, có khoảng tin cậy, biết từ chối  (~50 giây)</w:t>
+        <w:t>Slide 11 · Dự báo: có nhãn, có khoảng tin cậy, biết từ chối  (~50 giây)</w:t>
       </w:r>
     </w:p>
     <w:p>
@@ -1357,7 +1282,7 @@
         <w:pStyle w:val="Heading2"/>
       </w:pPr>
       <w:r>
-        <w:t>Slide 13 · Kiểm soát: an toàn và truy vết được thiết kế từ đầu  (~50 giây)</w:t>
+        <w:t>Slide 12 · Kiểm soát: an toàn và truy vết được thiết kế từ đầu  (~50 giây)</w:t>
       </w:r>
     </w:p>
     <w:p>
@@ -1391,7 +1316,7 @@
         <w:pStyle w:val="Heading2"/>
       </w:pPr>
       <w:r>
-        <w:t>Slide 14 · Kết quả kiểm thử: số liệu được kiểm chứng ra sao  (~45 giây)</w:t>
+        <w:t>Slide 13 · Kết quả kiểm thử: số liệu được kiểm chứng ra sao  (~45 giây)</w:t>
       </w:r>
     </w:p>
     <w:p>
@@ -1425,7 +1350,7 @@
         <w:pStyle w:val="Heading2"/>
       </w:pPr>
       <w:r>
-        <w:t>Slide 15 · Giới hạn đã biết  (~50 giây)</w:t>
+        <w:t>Slide 14 · Giới hạn đã biết  (~50 giây)</w:t>
       </w:r>
     </w:p>
     <w:p>
@@ -1459,7 +1384,7 @@
         <w:pStyle w:val="Heading2"/>
       </w:pPr>
       <w:r>
-        <w:t>Slide 16 · Chi phí AI ước tính: API hay máy chủ riêng  (~40 giây)</w:t>
+        <w:t>Slide 15 · Chi phí AI ước tính: API hay máy chủ riêng  (~40 giây)</w:t>
       </w:r>
     </w:p>
     <w:p>
@@ -1493,7 +1418,7 @@
         <w:pStyle w:val="Heading2"/>
       </w:pPr>
       <w:r>
-        <w:t>Slide 17 · Rủi ro và bước tiếp theo  (~45 giây)</w:t>
+        <w:t>Slide 16 · Rủi ro và bước tiếp theo  (~45 giây)</w:t>
       </w:r>
     </w:p>
     <w:p>
@@ -1527,7 +1452,7 @@
         <w:pStyle w:val="Heading2"/>
       </w:pPr>
       <w:r>
-        <w:t>Slide 18 · Đề xuất và kết  (~20 giây)</w:t>
+        <w:t>Slide 17 · Đề xuất và kết  (~20 giây)</w:t>
       </w:r>
     </w:p>
     <w:p>

</xml_diff>

<commit_message>
Presentation script: restore the flow slide, drop the decisions slide
</commit_message>
<xml_diff>
--- a/docs/ACBI_bai_trinh_bay.docx
+++ b/docs/ACBI_bai_trinh_bay.docx
@@ -57,7 +57,7 @@
           <w:b w:val="0"/>
           <w:i w:val="0"/>
         </w:rPr>
-        <w:t>Bài gồm 17 slide, thời lượng nói khoảng 11 phút 40 giây, chưa tính hỏi đáp. Mỗi slide có phần chữ trên slide (để nhớ ý) và phần lời nói đầy đủ để đọc hoặc nói theo.</w:t>
+        <w:t>Bài gồm 17 slide, thời lượng nói khoảng 11 phút 55 giây, chưa tính hỏi đáp. Mỗi slide có phần chữ trên slide (để nhớ ý) và phần lời nói đầy đủ để đọc hoặc nói theo.</w:t>
       </w:r>
     </w:p>
     <w:p>
@@ -377,7 +377,7 @@
               <w:rPr>
                 <w:sz w:val="20"/>
               </w:rPr>
-              <w:t>Vì sao chọn cách này</w:t>
+              <w:t>Luồng xử lý: mỗi câu hỏi đi qua năm bước kiểm soát</w:t>
             </w:r>
           </w:p>
         </w:tc>
@@ -390,7 +390,7 @@
               <w:rPr>
                 <w:sz w:val="20"/>
               </w:rPr>
-              <w:t>45 giây</w:t>
+              <w:t>60 giây</w:t>
             </w:r>
           </w:p>
         </w:tc>
@@ -884,7 +884,7 @@
                 <w:b/>
                 <w:sz w:val="20"/>
               </w:rPr>
-              <w:t>11 phút 40 giây</w:t>
+              <w:t>11 phút 55 giây</w:t>
             </w:r>
           </w:p>
         </w:tc>
@@ -1070,7 +1070,7 @@
           <w:b w:val="0"/>
           <w:i w:val="0"/>
         </w:rPr>
-        <w:t>Mỗi câu hỏi đi qua năm bước: hiểu câu hỏi, kiểm tra quyền, soạn truy vấn, kiểm tra câu lệnh, rồi chạy và trả lời. Ở bước đầu, hệ thống hiểu câu hỏi; nếu thiếu thông tin, ví dụ chưa nói kỳ nào, thì hỏi lại và nhớ cuộc trò chuyện. Tài khoản IT quản trị bị chặn ngay từ đầu vì không được xem số liệu kinh doanh. Bước hai là kiểm tra quyền: ngoài quyền thì từ chối, ghi nhật ký, và không có truy vấn nào được chạy. Bước ba có hai đường. Câu hỏi thường gặp đi đường mẫu: câu lệnh được lập từ mẫu có sẵn theo cách tính đã duyệt, nên hỏi cách nào cũng ra cùng một kết quả. Câu hỏi lạ, ví dụ theo tuần hay theo ngày, đi đường AI tự viết: hệ thống tìm định nghĩa và ví dụ liên quan để AI viết câu lệnh, và nếu lệch khuôn đã duyệt thì AI được sửa tối đa hai lần. Cả hai đường đều qua cùng một bước kiểm tra rồi mới chạy. Vậy trong các bước đó, dịch vụ AI nhận được gì? Đây là câu hội đồng hay hỏi nhất: dữ liệu của chúng tôi có bị gửi ra ngoài không? Slide này liệt kê đúng những gì dịch vụ AI nhận được, theo từng lần gọi. Khi hiểu câu hỏi, AI nhận câu hỏi, danh sách các chỉ số đã duyệt và vài lượt trò chuyện gần nhất, trong đó số tiền đã được che. Khi người dùng hỏi về dữ liệu, hoặc về câu vừa trả lời, AI nhận thêm nội dung của câu trả lời đó, kể cả số liệu. Khi cần tự viết câu lệnh cho câu hỏi lạ, AI nhận cách tính chỉ số, tên bảng và cột được phép, và tối đa hai ví dụ. Khi chọn biểu đồ, và chỉ khi quy tắc của hệ thống không chọn được, AI nhận số dòng cùng tên và kiểu cột, không có giá trị cụ thể. Tóm tắt bằng AI đang tắt mặc định. Giọng nói chỉ được gửi khi người dùng tự bấm ghi âm. Còn bảng kết quả, mật khẩu, khóa truy cập và vai trò thì không bao giờ được gửi. Trước khi dùng dữ liệu thật, chúng tôi cần xem điều khoản lưu dữ liệu của nhà cung cấp AI, phân loại mức nhạy cảm của dữ liệu và kiểm tra bảo mật độc lập.</w:t>
+        <w:t>Đây là câu hội đồng hay hỏi nhất: dữ liệu của chúng tôi có bị gửi ra ngoài không? Slide này liệt kê đúng những gì dịch vụ AI nhận được, theo từng lần gọi. Khi hiểu câu hỏi, AI nhận câu hỏi, danh sách các chỉ số đã duyệt và vài lượt trò chuyện gần nhất, trong đó số tiền đã được che. Khi người dùng hỏi về dữ liệu, hoặc về câu vừa trả lời, AI nhận thêm nội dung của câu trả lời đó, kể cả số liệu. Khi cần tự viết câu lệnh cho câu hỏi lạ, AI nhận cách tính chỉ số, tên bảng và cột được phép, và tối đa hai ví dụ. Khi chọn biểu đồ, và chỉ khi quy tắc của hệ thống không chọn được, AI nhận số dòng cùng tên và kiểu cột, không có giá trị cụ thể. Tóm tắt bằng AI đang tắt mặc định. Giọng nói chỉ được gửi khi người dùng tự bấm ghi âm. Còn bảng kết quả, mật khẩu, khóa truy cập và vai trò thì không bao giờ được gửi. Trước khi dùng dữ liệu thật, chúng tôi cần xem điều khoản lưu dữ liệu của nhà cung cấp AI, phân loại mức nhạy cảm của dữ liệu và kiểm tra bảo mật độc lập.</w:t>
       </w:r>
     </w:p>
     <w:p>
@@ -1078,7 +1078,7 @@
         <w:pStyle w:val="Heading2"/>
       </w:pPr>
       <w:r>
-        <w:t>Slide 6 · Vì sao chọn cách này  (~45 giây)</w:t>
+        <w:t>Slide 6 · Luồng xử lý: mỗi câu hỏi đi qua năm bước kiểm soát  (~60 giây)</w:t>
       </w:r>
     </w:p>
     <w:p>
@@ -1092,7 +1092,7 @@
           <w:color w:val="555B66"/>
           <w:sz w:val="20"/>
         </w:rPr>
-        <w:t>Trên slide: Bốn quyết định kiến trúc kèm phương án đã loại: kết hợp hai đường truy vấn, AI qua API, backend kiểm soát truy cập, biểu đồ theo quy tắc.</w:t>
+        <w:t>Trên slide: Hiểu câu hỏi, kiểm tra quyền, dựng truy vấn, kiểm tra câu lệnh, chạy và trả lời. Hai đường: câu thường gặp dựng từ mẫu, câu lạ do AI viết.</w:t>
       </w:r>
     </w:p>
     <w:p>
@@ -1104,7 +1104,7 @@
           <w:b w:val="0"/>
           <w:i w:val="0"/>
         </w:rPr>
-        <w:t>Slide này nói vì sao chúng tôi chọn cách làm này, và đã cân nhắc những phương án nào khác. Một, dùng cả hai đường: câu thường gặp đi đường mẫu nên kết quả luôn nhất quán, câu lạ thì để AI viết câu lệnh. Chúng tôi không chọn chỉ dùng đường mẫu vì quá hẹp, cũng không để AI viết hết vì dễ sai cách tính nghiệp vụ. Hai, thuê AI qua dịch vụ bên ngoài để không phải tự vận hành mô hình. Chạy mô hình trên máy chủ riêng tốn khoảng 200 đến 500 đô la mỗi tháng và cần người vận hành, nên chỉ nên dùng khi bắt buộc không để dữ liệu ra ngoài. Ba, hệ thống tự kiểm soát truy cập: AI không có đường tới kho dữ liệu và câu lệnh nào cũng được kiểm tra. Chúng tôi chưa cho AI tự gọi công cụ truy vấn vì khó kiểm thử và khó đoán được số lần gọi, và sẽ xem lại nếu kiểm thử cho thấy cần. Bốn, biểu đồ chọn theo quy tắc trước, AI chỉ hỗ trợ, để kết quả dễ đoán, rẻ và kiểm tra được.</w:t>
+        <w:t>Mỗi câu hỏi đi qua năm bước. Đầu tiên, hệ thống hiểu câu hỏi, thường là nhờ AI; nếu thiếu thông tin, ví dụ chưa nói kỳ nào, hệ thống hỏi lại và nhớ cuộc trò chuyện. Riêng tài khoản IT quản trị bị chặn ngay từ đầu vì không được xem số liệu kinh doanh. Bước hai là kiểm tra quyền: ngoài quyền thì từ chối, ghi nhật ký, và không có truy vấn nào được chạy. Bước ba là soạn truy vấn, có hai đường. Câu hỏi thường gặp đi đường mẫu: câu lệnh được lập từ mẫu có sẵn theo cách tính đã duyệt, nên hỏi cách nào cũng ra cùng một kết quả. Câu hỏi lạ, ví dụ theo tuần hay theo ngày, đi đường thứ hai: hệ thống tìm định nghĩa và ví dụ liên quan để AI viết câu lệnh, và nếu lệch khuôn đã duyệt thì AI được sửa tối đa hai lần. Cả hai đường đều qua cùng một bước kiểm tra rồi mới chạy.</w:t>
       </w:r>
     </w:p>
     <w:p>

</xml_diff>

<commit_message>
Fix review findings: first-run figures, tested commit and date, over-absolute claims
</commit_message>
<xml_diff>
--- a/docs/ACBI_bai_trinh_bay.docx
+++ b/docs/ACBI_bai_trinh_bay.docx
@@ -1002,7 +1002,7 @@
           <w:b w:val="0"/>
           <w:i w:val="0"/>
         </w:rPr>
-        <w:t>Nguyên tắc xuyên suốt: AI chỉ giúp hiểu câu hỏi, còn quyết định lấy dữ liệu nào là việc của hệ thống. AI có thể hiểu câu hỏi hoặc gợi ý một câu lệnh truy vấn, nhưng việc kiểm tra quyền, kiểm tra câu lệnh và tính con số đều do hệ thống và cơ sở dữ liệu làm. Nhờ vậy, kể cả khi AI hiểu sai, nó cũng không thể lấy dữ liệu ngoài quyền hay tự bịa ra số liệu.</w:t>
+        <w:t>Nguyên tắc xuyên suốt: AI chỉ giúp hiểu câu hỏi, còn quyết định lấy dữ liệu nào là việc của hệ thống. AI có thể hiểu câu hỏi hoặc gợi ý một câu lệnh truy vấn, nhưng việc kiểm tra quyền, kiểm tra câu lệnh và tính con số đều do hệ thống và cơ sở dữ liệu làm. Nhờ vậy, kể cả khi AI hiểu sai, nó cũng không thể lấy dữ liệu ngoài quyền, và các con số luôn do cơ sở dữ liệu tính ra chứ không phải do AI viết.</w:t>
       </w:r>
     </w:p>
     <w:p>
@@ -1036,7 +1036,7 @@
           <w:b w:val="0"/>
           <w:i w:val="0"/>
         </w:rPr>
-        <w:t>Hệ thống có ba khối chính: giao diện web, phần xử lý trung tâm viết bằng Python, và nơi lưu trữ của ứng dụng. Phần xử lý chia thành các nhóm việc rõ ràng: điều phối, phân quyền, hội thoại, kết nối AI, định nghĩa chỉ số, dựng và kiểm tra câu lệnh, trình bày kết quả, lưu lịch sử. Có hai dịch vụ bên ngoài: AI hiểu ngôn ngữ và dịch vụ chuyển giọng nói thành chữ, đều gọi qua kết nối mã hoá, khóa truy cập giữ trên máy chủ. Kho dữ liệu của công ty chỉ được đọc, và AI không có đường nào tới đó. Chính xác AI nhận gì thì tôi sẽ nói ở slide sau. Hệ thống triển khai gọn bằng ba container: web, xử lý và cơ sở dữ liệu của ứng dụng.</w:t>
+        <w:t>Hệ thống có ba khối chính: giao diện web, phần xử lý trung tâm viết bằng Python, và nơi lưu trữ của ứng dụng. Phần xử lý chia thành các nhóm việc rõ ràng: điều phối, phân quyền, hội thoại, kết nối AI, định nghĩa chỉ số, dựng và kiểm tra câu lệnh, trình bày kết quả, lưu lịch sử. Có hai dịch vụ bên ngoài: AI hiểu ngôn ngữ và dịch vụ chuyển giọng nói thành chữ, đều gọi qua kết nối mã hoá, khóa truy cập giữ trên máy chủ. Kho dữ liệu của công ty chỉ được đọc, và AI không có đường nào tới đó. Chính xác AI nhận gì thì tôi sẽ nói ở slide sau. Kiến trúc triển khai dự kiến cho môi trường công ty tự quản lý dùng ba container: web, xử lý và cơ sở dữ liệu của ứng dụng; bản demo hiện chạy trên nền tảng đám mây Vercel.</w:t>
       </w:r>
     </w:p>
     <w:p>
@@ -1070,7 +1070,7 @@
           <w:b w:val="0"/>
           <w:i w:val="0"/>
         </w:rPr>
-        <w:t>Đây là câu hội đồng hay hỏi nhất: dữ liệu của chúng tôi có bị gửi ra ngoài không? Slide này liệt kê đúng những gì dịch vụ AI nhận được, theo từng lần gọi. Khi hiểu câu hỏi, AI nhận câu hỏi, danh sách các chỉ số đã duyệt và vài lượt trò chuyện gần nhất, trong đó số tiền đã được che. Khi người dùng hỏi về dữ liệu, hoặc về câu vừa trả lời, AI nhận thêm nội dung của câu trả lời đó, kể cả số liệu. Khi cần tự viết câu lệnh cho câu hỏi lạ, AI nhận cách tính chỉ số, tên bảng và cột được phép, và tối đa hai ví dụ. Khi chọn biểu đồ, và chỉ khi quy tắc của hệ thống không chọn được, AI nhận số dòng cùng tên và kiểu cột, không có giá trị cụ thể. Tóm tắt bằng AI đang tắt mặc định. Giọng nói chỉ được gửi khi người dùng tự bấm ghi âm. Còn bảng kết quả, mật khẩu, khóa truy cập và vai trò thì không bao giờ được gửi. Trước khi dùng dữ liệu thật, chúng tôi cần xem điều khoản lưu dữ liệu của nhà cung cấp AI, phân loại mức nhạy cảm của dữ liệu và kiểm tra bảo mật độc lập.</w:t>
+        <w:t>Đây là câu hội đồng hay hỏi nhất: dữ liệu của chúng tôi có bị gửi ra ngoài không? Slide này liệt kê đúng những gì dịch vụ AI nhận được, theo từng lần gọi. Khi hiểu câu hỏi, AI nhận câu hỏi, danh sách các chỉ số đã duyệt và vài lượt trò chuyện gần nhất, trong đó số tiền đã được che. Khi người dùng hỏi về dữ liệu, hoặc về câu vừa trả lời, AI nhận thêm nội dung của câu trả lời đó, kể cả số liệu. Khi cần tự viết câu lệnh cho câu hỏi lạ, AI nhận cách tính chỉ số, tên bảng và cột được phép, và tối đa hai ví dụ. Khi chọn biểu đồ, và chỉ khi quy tắc của hệ thống không chọn được, AI nhận số dòng cùng tên và kiểu cột, không có giá trị cụ thể. Tóm tắt bằng AI đang tắt mặc định. Giọng nói chỉ được gửi khi người dùng tự bấm ghi âm. Mật khẩu, khóa truy cập, vai trò và mã người dùng thì không bao giờ được gửi; bảng kết quả chỉ được gửi nếu bật tóm tắt bằng AI, mà mặc định đang tắt. Trước khi dùng dữ liệu thật, chúng tôi cần xem điều khoản lưu dữ liệu của nhà cung cấp AI, phân loại mức nhạy cảm của dữ liệu và kiểm tra bảo mật độc lập.</w:t>
       </w:r>
     </w:p>
     <w:p>
@@ -1104,7 +1104,7 @@
           <w:b w:val="0"/>
           <w:i w:val="0"/>
         </w:rPr>
-        <w:t>Mỗi câu hỏi đi qua năm bước. Đầu tiên, hệ thống hiểu câu hỏi, thường là nhờ AI; nếu thiếu thông tin, ví dụ chưa nói kỳ nào, hệ thống hỏi lại và nhớ cuộc trò chuyện. Riêng tài khoản IT quản trị bị chặn ngay từ đầu vì không được xem số liệu kinh doanh. Bước hai là kiểm tra quyền: ngoài quyền thì từ chối, ghi nhật ký, và không có truy vấn nào được chạy. Bước ba là soạn truy vấn, có hai đường. Câu hỏi thường gặp đi đường mẫu: câu lệnh được lập từ mẫu có sẵn theo cách tính đã duyệt, nên hỏi cách nào cũng ra cùng một kết quả. Câu hỏi lạ, ví dụ theo tuần hay theo ngày, đi đường thứ hai: hệ thống tìm định nghĩa và ví dụ liên quan để AI viết câu lệnh, và nếu lệch khuôn đã duyệt thì AI được sửa tối đa hai lần. Cả hai đường đều qua cùng một bước kiểm tra rồi mới chạy.</w:t>
+        <w:t>Mỗi câu hỏi đi qua năm bước. Đầu tiên, hệ thống hiểu câu hỏi, thường là nhờ AI; nếu thiếu thông tin, ví dụ chưa nói kỳ nào, hệ thống hỏi lại và nhớ cuộc trò chuyện. Riêng tài khoản IT quản trị bị chặn ngay từ đầu vì không được xem số liệu kinh doanh. Bước hai là kiểm tra quyền: ngoài quyền thì từ chối, ghi nhật ký, và không có truy vấn nào được chạy. Bước ba là soạn truy vấn, có hai đường. Câu hỏi thường gặp đi đường mẫu: câu lệnh được lập từ mẫu có sẵn theo cách tính đã duyệt, nên hỏi cách nào cũng ra cùng một kết quả. Câu hỏi lạ, ví dụ theo tuần hay theo ngày, đi đường thứ hai: hệ thống tìm định nghĩa và ví dụ liên quan để AI viết câu lệnh, và nếu lệch khuôn đã duyệt thì AI được sửa tối đa hai lần. Cả hai đường đều qua cùng một bước kiểm tra rồi mới chạy. Bước kiểm tra này chặn những câu lệnh vi phạm quy tắc, nhưng không tự chứng minh cách tính đúng nghiệp vụ; phần đó dựa vào định nghĩa chỉ số đã duyệt và việc đối chiếu độc lập ở phần kiểm thử.</w:t>
       </w:r>
     </w:p>
     <w:p>
@@ -1274,7 +1274,7 @@
           <w:b w:val="0"/>
           <w:i w:val="0"/>
         </w:rPr>
-        <w:t>Hệ thống còn dự báo được doanh thu và sản lượng. Dự báo dùng phương pháp làm trơn hàm mũ, giống gói forecast của R và thư viện statsmodels; tôi đã đối chiếu và kết quả khớp với statsmodels. Câu trả lời luôn mở đầu bằng "Dự báo, không phải số liệu đã ghi nhận", kèm khoảng dao động 95% và mức sai số khi thử lại. Quan trọng nhất: hệ thống thử dự báo lại 6 tháng gần nhất, nếu lệch quá 35% thì từ chối, không đưa ra con số. Trên dữ liệu mẫu, một vài khu vực như Pháp, Canada bị từ chối vì lý do này. Chúng tôi cũng thử lùi dần nhiều mốc và so với cách tính đơn giản như lấy tháng trước hoặc trung bình ba tháng: sai số khoảng 18 đến 26 phần trăm, ngang với các cách đó. Vì vậy dự báo luôn kèm sai số và có cơ chế từ chối, và chúng tôi không quảng bá độ chính xác của nó. Đây là chức năng tạm thời, phạm vi dự báo còn phụ thuộc nghiệp vụ. Lưu ý: tháng 5 năm 2025 của dữ liệu mẫu gần như trống nên đường dự báo thấp hơn các tháng trước.</w:t>
+        <w:t>Hệ thống còn dự báo được doanh thu và sản lượng. Dự báo dùng phương pháp làm trơn hàm mũ, giống gói forecast của R và thư viện statsmodels; tôi đã đối chiếu và kết quả khớp với statsmodels. Câu trả lời luôn mở đầu bằng "Dự báo, không phải số liệu đã ghi nhận", kèm khoảng dao động 95% và mức sai số khi thử lại. Quan trọng nhất: hệ thống thử dự báo lại 6 tháng gần nhất, nếu lệch quá 35% thì từ chối, không đưa ra con số. Trên dữ liệu mẫu, một vài khu vực như Pháp, Canada bị từ chối vì lý do này. Chúng tôi cũng thử lùi dần nhiều mốc và so với cách tính đơn giản như lấy tháng trước hoặc trung bình ba tháng: sai số khoảng 18 đến 26 phần trăm, ngang với các cách đó. Vì vậy dự báo luôn kèm sai số và có cơ chế từ chối, và chúng tôi không quảng bá độ chính xác của nó. Khoảng dao động 95% trong thử nghiệm chỉ phủ được từ 67% đến 100% số lần, tức chưa hiệu chỉnh tốt. Đây là chức năng tạm thời, phạm vi dự báo còn phụ thuộc nghiệp vụ. Lưu ý: tháng 5 năm 2025 của dữ liệu mẫu gần như trống nên đường dự báo thấp hơn các tháng trước.</w:t>
       </w:r>
     </w:p>
     <w:p>
@@ -1342,7 +1342,7 @@
           <w:b w:val="0"/>
           <w:i w:val="0"/>
         </w:rPr>
-        <w:t>Về kiểm thử: chúng tôi chạy ba bộ câu hỏi trên bản demo, dùng AI thật, tổng cộng 161 câu. Mỗi con số trả về đều được tính lại độc lập từ kho dữ liệu bằng một câu lệnh riêng, chỉ đọc, không dùng lại phần dựng câu lệnh của ứng dụng. Bộ thứ nhất có 24 câu cần AI tự viết câu lệnh, như theo tuần, theo ngày, theo nhà máy, theo vai trò: đạt 24 trên 24. Bộ thứ hai có 90 câu hỏi khó, gồm câu bẫy, câu nhiều điều kiện và đủ bốn vai trò: đạt 90 trên 90. Bộ thứ ba có 47 câu so sánh và tin nhắn nhiều yêu cầu: đạt 47 trên 47. Có 154 bảng số liệu được so từng giá trị với kho dữ liệu và đều khớp; một số ít loại kết quả như theo sản phẩm hay ngành hàng thì chỉ kiểm tra trạng thái và nội dung. Lượt chạy đầu có 12 câu bị báo AI bận vì gói AI miễn phí; chúng tôi chạy lại đến khi hết báo bận và đều đạt. Câu sai vì lý do khác thì tính là sai, không chạy lại để đổi kết quả. Ngoài ra, 48 ca phân quyền chạy đủ bốn vai trò, trên cả hai đường, đều đạt: không có dữ liệu ngoài quyền nào lọt ra. Cuối cùng là 287 kiểm thử tự động cho phần logic. Bằng chứng từng ca, gồm câu hỏi, câu trả lời, câu lệnh đối chiếu và ảnh chụp, nằm trong file Excel kèm theo.</w:t>
+        <w:t>Về kiểm thử: chúng tôi chạy ba bộ câu hỏi trên bản demo, dùng AI thật, tổng cộng 161 câu. Mỗi con số trả về đều được tính lại độc lập từ kho dữ liệu bằng một câu lệnh riêng, chỉ đọc, không dùng lại phần dựng câu lệnh của ứng dụng. Bộ thứ nhất có 24 câu cần AI tự viết câu lệnh, như theo tuần, theo ngày, theo nhà máy, theo vai trò: đạt 24 trên 24. Bộ thứ hai có 90 câu hỏi khó, gồm câu bẫy, câu nhiều điều kiện và đủ bốn vai trò: đạt 90 trên 90. Bộ thứ ba có 47 câu so sánh và tin nhắn nhiều yêu cầu: đạt 47 trên 47. Có 154 bảng số liệu được so từng giá trị với kho dữ liệu và đều khớp; một số ít loại kết quả như theo sản phẩm hay ngành hàng thì chỉ kiểm tra trạng thái và nội dung. Lượt chạy đầu có 145 câu đạt, 1 câu sai và 15 câu bị báo AI bận vì gói AI miễn phí. Chúng tôi chạy lại các câu báo bận đến khi hết báo bận, kết quả lượt đầu vẫn được giữ trong báo cáo; câu sai vì lý do khác không được chạy lại để đổi kết quả. Ngoài ra, 48 ca phân quyền chạy đủ bốn vai trò, trên cả hai đường, đều đạt: không có dữ liệu ngoài quyền nào lọt ra. Cuối cùng là 287 kiểm thử tự động cho phần logic. Bằng chứng từng ca, gồm câu hỏi, câu trả lời, câu lệnh đối chiếu và ảnh chụp, nằm trong file Excel kèm theo.</w:t>
       </w:r>
     </w:p>
     <w:p>
@@ -1376,7 +1376,7 @@
           <w:b w:val="0"/>
           <w:i w:val="0"/>
         </w:rPr>
-        <w:t>Tôi muốn nói trước những giới hạn đã biết. Một là tốc độ: thử với năm người dùng cùng lúc, chỉ 39 trên 60 câu được trả lời, tức 65%, và 63% xong trong 15 giây, trong khi mục tiêu là 95%. Lần đo trước là 34 trên 60. Mọi lỗi đều do gói AI miễn phí giới hạn tốc độ chứ không phải do kiến trúc; những câu không cần AI trả lời trong khoảng 0,3 giây. Cùng nguyên nhân đó, khi chạy 161 câu kiểm thử, 12 câu bị báo AI bận ở lượt đầu; chúng tôi chạy lại và đều đạt. Hai là dữ liệu mẫu: bảng nhà máy là giả lập nên Factory C không có sản lượng, và tháng 5 năm 2025 gần như trống. Ba là AI không ổn định tuyệt đối: cùng một câu có thể được hiểu khác nhau giữa các lần hỏi, và chúng tôi chưa đo điều này một cách bài bản. Bốn là những phần chưa kiểm tra: giọng nói trong môi trường thật, giao diện điện thoại và kiểm tra bảo mật độc lập.</w:t>
+        <w:t>Tôi muốn nói trước những giới hạn đã biết. Một là tốc độ: thử với năm người dùng cùng lúc, chỉ 39 trên 60 câu được trả lời, tức 65%, và 63% xong trong 15 giây, trong khi mục tiêu là 95%. Lần đo trước là 34 trên 60. Mọi lỗi ghi nhận được đều là giới hạn tốc độ của gói AI miễn phí, chưa thấy lỗi nào do phần xử lý của chúng tôi, nhưng cần đo lại với gói trả phí để chắc chắn; những câu không cần AI trả lời trong khoảng 0,3 giây. Cùng nguyên nhân đó, khi chạy 161 câu kiểm thử, 15 câu bị báo AI bận ở lượt đầu; chúng tôi chạy lại và đều đạt. Hai là dữ liệu mẫu: bảng nhà máy là giả lập nên Factory C không có sản lượng, và tháng 5 năm 2025 gần như trống. Ba là AI không ổn định tuyệt đối: cùng một câu có thể được hiểu khác nhau giữa các lần hỏi, và chúng tôi chưa đo điều này một cách bài bản. Bốn là những phần chưa kiểm tra: giọng nói trong môi trường thật, giao diện điện thoại và kiểm tra bảo mật độc lập.</w:t>
       </w:r>
     </w:p>
     <w:p>
@@ -1444,7 +1444,7 @@
           <w:b w:val="0"/>
           <w:i w:val="0"/>
         </w:rPr>
-        <w:t>Có bốn rủi ro chính, đã nêu trong tài liệu cùng cách giảm thiểu: số liệu sai dù câu lệnh vẫn chạy được, lộ dữ liệu ngoài quyền, phụ thuộc vào dịch vụ AI bên ngoài, và phạm vi kiểm thử còn hẹp. Bước tiếp theo tôi đề xuất năm việc. Một, chuyển sang gói AI trả phí rồi đo lại tốc độ, vì kết quả hôm nay bị giới hạn bởi gói miễn phí. Hai, cùng các phòng ban chốt cách tính chỉ số và quyền xem. Ba, xây bộ 100 đến 200 câu hỏi thật và chạy nhiều lần để đo độ ổn định. Bốn, chạy thử với dữ liệu thật của công ty. Năm, tài liệu giải pháp đã được cập nhật lên bản 1.1; riêng phần dự báo chưa đưa vào vì còn phụ thuộc nghiệp vụ. Ở bản chính thức, chúng tôi dùng một nhà cung cấp AI trả phí hoặc mô hình chạy trong công ty; việc luân phiên nhiều AI miễn phí chỉ là cách tạm cho giai đoạn demo.</w:t>
+        <w:t>Có bốn rủi ro chính, đã nêu trong tài liệu cùng cách giảm thiểu: số liệu sai dù câu lệnh vẫn chạy được, lộ dữ liệu ngoài quyền, phụ thuộc vào dịch vụ AI bên ngoài, và phạm vi kiểm thử còn hẹp. Bước tiếp theo tôi đề xuất năm việc. Một, chuyển sang gói AI trả phí rồi đo lại tốc độ, vì kết quả hôm nay bị giới hạn bởi gói miễn phí. Hai, cùng các phòng ban chốt cách tính chỉ số và quyền xem. Ba, xây bộ 100 đến 200 câu hỏi thật và chạy nhiều lần để đo độ ổn định. Bốn, chạy thử với dữ liệu thật của công ty, nhưng chỉ sau khi nhà cung cấp AI được duyệt về điều khoản lưu dữ liệu và đã kiểm tra bảo mật độc lập. Năm, tài liệu giải pháp đã được cập nhật lên bản 1.1; riêng phần dự báo chưa đưa vào vì còn phụ thuộc nghiệp vụ. Ở bản chính thức, chúng tôi dùng một nhà cung cấp AI trả phí hoặc mô hình chạy trong công ty; việc luân phiên nhiều AI miễn phí chỉ là cách tạm cho giai đoạn demo.</w:t>
       </w:r>
     </w:p>
     <w:p>

</xml_diff>

<commit_message>
Presentation script: voice status, C23, security checks, conditional-pilot closing
</commit_message>
<xml_diff>
--- a/docs/ACBI_bai_trinh_bay.docx
+++ b/docs/ACBI_bai_trinh_bay.docx
@@ -934,7 +934,7 @@
           <w:b w:val="0"/>
           <w:i w:val="0"/>
         </w:rPr>
-        <w:t>Xin chào anh chị. Hôm nay tôi giới thiệu ACBI, một hệ thống cho phép hỏi dữ liệu kinh doanh bằng tiếng Việt, qua chat hoặc giọng nói, và nhận lại câu trả lời có số liệu kiểm chứng được. Phần trình bày khoảng mười hai phút, gồm giải pháp, demo trên hệ thống đang chạy và kết quả kiểm thử, sau đó là phần hỏi đáp.</w:t>
+        <w:t>Xin chào anh chị. Hôm nay tôi giới thiệu ACBI, một hệ thống cho phép hỏi dữ liệu kinh doanh bằng tiếng Việt, qua chat hoặc giọng nói, và nhận lại câu trả lời có số liệu kiểm chứng được. Giọng nói có trong thiết kế nhưng chưa bật trên bản demo hôm nay, nên phần demo chạy bằng chat. Phần trình bày khoảng mười hai phút, gồm giải pháp, demo trên hệ thống đang chạy và kết quả kiểm thử, sau đó là phần hỏi đáp.</w:t>
       </w:r>
     </w:p>
     <w:p>
@@ -1070,7 +1070,7 @@
           <w:b w:val="0"/>
           <w:i w:val="0"/>
         </w:rPr>
-        <w:t>Đây là câu hội đồng hay hỏi nhất: dữ liệu của chúng tôi có bị gửi ra ngoài không? Slide này liệt kê đúng những gì dịch vụ AI nhận được, theo từng lần gọi. Khi hiểu câu hỏi, AI nhận câu hỏi, danh sách các chỉ số đã duyệt và vài lượt trò chuyện gần nhất, trong đó số tiền đã được che. Khi người dùng hỏi về dữ liệu, hoặc về câu vừa trả lời, AI nhận thêm nội dung của câu trả lời đó, kể cả số liệu. Khi cần tự viết câu lệnh cho câu hỏi lạ, AI nhận cách tính chỉ số, tên bảng và cột được phép, và tối đa hai ví dụ. Khi chọn biểu đồ, và chỉ khi quy tắc của hệ thống không chọn được, AI nhận số dòng cùng tên và kiểu cột, không có giá trị cụ thể. Tóm tắt bằng AI đang tắt mặc định. Giọng nói chỉ được gửi khi người dùng tự bấm ghi âm. Mật khẩu, khóa truy cập, vai trò và mã người dùng thì không bao giờ được gửi; bảng kết quả chỉ được gửi nếu bật tóm tắt bằng AI, mà mặc định đang tắt. Trước khi dùng dữ liệu thật, chúng tôi cần xem điều khoản lưu dữ liệu của nhà cung cấp AI, phân loại mức nhạy cảm của dữ liệu và kiểm tra bảo mật độc lập.</w:t>
+        <w:t>Đây là câu hội đồng hay hỏi nhất: dữ liệu của chúng tôi có bị gửi ra ngoài không? Slide này liệt kê đúng những gì dịch vụ AI nhận được, theo từng lần gọi. Khi hiểu câu hỏi, AI nhận câu hỏi, danh sách các chỉ số đã duyệt, hiện chưa lọc theo vai trò và là điểm cần rà soát trước khi dùng dữ liệu thật, và vài lượt trò chuyện gần nhất, trong đó số tiền đã được che. Khi người dùng hỏi về dữ liệu, hoặc về câu vừa trả lời, AI nhận thêm nội dung của câu trả lời đó, kể cả số liệu. Khi cần tự viết câu lệnh cho câu hỏi lạ, AI nhận cách tính chỉ số, tên bảng và cột được phép, và tối đa hai ví dụ. Khi chọn biểu đồ, và chỉ khi quy tắc của hệ thống không chọn được, AI nhận số dòng cùng tên và kiểu cột, không có giá trị cụ thể. Tóm tắt bằng AI đang tắt mặc định. Giọng nói chỉ được gửi khi người dùng tự bấm ghi âm. Mật khẩu, khóa truy cập, vai trò và mã người dùng thì không bao giờ được gửi; bảng kết quả chỉ được gửi nếu bật tóm tắt bằng AI, mà mặc định đang tắt. Trước khi dùng dữ liệu thật, chúng tôi cần xem điều khoản lưu dữ liệu của nhà cung cấp AI, phân loại mức nhạy cảm của dữ liệu và kiểm tra bảo mật độc lập.</w:t>
       </w:r>
     </w:p>
     <w:p>
@@ -1240,7 +1240,7 @@
           <w:b w:val="0"/>
           <w:i w:val="0"/>
         </w:rPr>
-        <w:t>Mỗi câu trả lời đều có phần "Nguồn dữ liệu và cách tính". Ở đây là câu "Doanh thu của Canada năm 2023": người dùng thấy ngày tham chiếu, khoảng thời gian truy vấn, câu lệnh đã chạy và các giá trị đã dùng. Giá trị người dùng nhập, như "Canada", luôn được truyền riêng chứ không ghép thẳng vào câu lệnh, nên không thể chèn lệnh độc hại. Kết quả và nguồn được lưu lại để xem lại sau.</w:t>
+        <w:t>Mỗi câu trả lời đều có phần "Nguồn dữ liệu và cách tính". Ở đây là câu "Doanh thu của Canada năm 2023": người dùng thấy ngày tham chiếu, khoảng thời gian truy vấn, câu lệnh đã chạy và các giá trị đã dùng. Giá trị người dùng nhập, như "Canada", luôn được truyền riêng chứ không ghép thẳng vào câu lệnh, nên không thể chèn lệnh độc hại. Kết quả và nguồn được lưu lại để xem lại sau, kèm phiên bản cách tính chỉ số. Nếu kết quả bị cắt vì giới hạn số dòng, câu trả lời nói rõ chỉ hiển thị một phần. Báo cáo kiểm thử ghi hiện chưa có ca kiểm thử riêng cho phần nguồn dữ liệu này.</w:t>
       </w:r>
     </w:p>
     <w:p>
@@ -1342,7 +1342,7 @@
           <w:b w:val="0"/>
           <w:i w:val="0"/>
         </w:rPr>
-        <w:t>Về kiểm thử: chúng tôi chạy ba bộ câu hỏi trên bản demo, dùng AI thật, tổng cộng 161 câu. Mỗi con số trả về đều được tính lại độc lập từ kho dữ liệu bằng một câu lệnh riêng, chỉ đọc, không dùng lại phần dựng câu lệnh của ứng dụng. Bộ thứ nhất có 24 câu cần AI tự viết câu lệnh, như theo tuần, theo ngày, theo nhà máy, theo vai trò: đạt 24 trên 24. Bộ thứ hai có 90 câu hỏi khó, gồm câu bẫy, câu nhiều điều kiện và đủ bốn vai trò: đạt 90 trên 90. Bộ thứ ba có 47 câu so sánh và tin nhắn nhiều yêu cầu: đạt 47 trên 47. Có 154 bảng số liệu được so từng giá trị với kho dữ liệu và đều khớp; một số ít loại kết quả như theo sản phẩm hay ngành hàng thì chỉ kiểm tra trạng thái và nội dung. Lượt chạy đầu có 145 câu đạt, 1 câu sai và 15 câu bị báo AI bận vì gói AI miễn phí. Chúng tôi chạy lại các câu báo bận đến khi hết báo bận, kết quả lượt đầu vẫn được giữ trong báo cáo; câu sai vì lý do khác không được chạy lại để đổi kết quả. Ngoài ra, 48 ca phân quyền chạy đủ bốn vai trò, trên cả hai đường, đều đạt: không có dữ liệu ngoài quyền nào lọt ra. Cuối cùng là 287 kiểm thử tự động cho phần logic. Bằng chứng từng ca, gồm câu hỏi, câu trả lời, câu lệnh đối chiếu và ảnh chụp, nằm trong file Excel kèm theo.</w:t>
+        <w:t>Về kiểm thử: chúng tôi chạy ba bộ câu hỏi trên bản demo, dùng AI thật, tổng cộng 161 câu. Mỗi con số trả về đều được tính lại độc lập từ kho dữ liệu bằng một câu lệnh riêng, chỉ đọc, không dùng lại phần dựng câu lệnh của ứng dụng. Bộ thứ nhất có 24 câu cần AI tự viết câu lệnh, như theo tuần, theo ngày, theo nhà máy, theo vai trò: đạt 24 trên 24. Bộ thứ hai có 90 câu hỏi khó, gồm câu bẫy, câu nhiều điều kiện và đủ bốn vai trò: đạt 90 trên 90. Bộ thứ ba có 47 câu so sánh và tin nhắn nhiều yêu cầu: đạt 47 trên 47. Có 154 bảng số liệu được so từng giá trị với kho dữ liệu và đều khớp; một số ít loại kết quả như theo sản phẩm hay ngành hàng thì chỉ kiểm tra trạng thái và nội dung. Lượt chạy đầu có 145 câu đạt, 1 câu sai và 15 câu bị báo AI bận vì gói AI miễn phí. Chúng tôi chạy lại các câu báo bận đến khi hết báo bận, kết quả lượt đầu vẫn được giữ trong báo cáo. Câu sai duy nhất là C23, so sánh hai nhà máy: chúng tôi sửa để hệ thống chỉ hiển thị hai nhà máy được hỏi và ghi rõ phần chưa gồm, và sửa cả tiêu chí đối chiếu vì ban đầu nó coi phần lược bỏ có chủ đích là thiếu nhóm. Kết quả trước và sau khi sửa đều nằm trong báo cáo. Ngoài ra, 48 ca phân quyền chạy đủ bốn vai trò, trên cả hai đường, đều đạt: không có dữ liệu ngoài quyền nào lọt ra trong các kịch bản đã thử. Đây là kiểm thử theo kịch bản, chưa phải kiểm tra xâm nhập độc lập. Chúng tôi cũng tự chạy 29 kiểm tra bảo mật từ bên ngoài, như gọi không có token, token giả, xem dữ liệu của người khác, chèn lệnh SQL và chèn lệnh vào câu hỏi; lần đầu có một lỗi nhỏ về tiêu đề bảo mật của trang web, đã sửa, và hiện đạt cả 29. Đây vẫn là kiểm tra nội bộ. Kiểm tra xâm nhập độc lập cần bên thứ ba, ủy quyền và cấu hình đăng nhập thật, nên được đặt làm điều kiện trước khi dùng dữ liệu thật. Cuối cùng là 287 kiểm thử tự động cho phần logic. Bằng chứng từng ca, gồm câu hỏi, câu trả lời, câu lệnh đối chiếu và ảnh chụp, nằm trong file Excel kèm theo.</w:t>
       </w:r>
     </w:p>
     <w:p>
@@ -1376,7 +1376,7 @@
           <w:b w:val="0"/>
           <w:i w:val="0"/>
         </w:rPr>
-        <w:t>Tôi muốn nói trước những giới hạn đã biết. Một là tốc độ: thử với năm người dùng cùng lúc, chỉ 39 trên 60 câu được trả lời, tức 65%, và 63% xong trong 15 giây, trong khi mục tiêu là 95%. Lần đo trước là 34 trên 60. Mọi lỗi ghi nhận được đều là giới hạn tốc độ của gói AI miễn phí, chưa thấy lỗi nào do phần xử lý của chúng tôi, nhưng cần đo lại với gói trả phí để chắc chắn; những câu không cần AI trả lời trong khoảng 0,3 giây. Cùng nguyên nhân đó, khi chạy 161 câu kiểm thử, 15 câu bị báo AI bận ở lượt đầu; chúng tôi chạy lại và đều đạt. Hai là dữ liệu mẫu: bảng nhà máy là giả lập nên Factory C không có sản lượng, và tháng 5 năm 2025 gần như trống. Ba là AI không ổn định tuyệt đối: cùng một câu có thể được hiểu khác nhau giữa các lần hỏi, và chúng tôi chưa đo điều này một cách bài bản. Bốn là những phần chưa kiểm tra: giọng nói trong môi trường thật, giao diện điện thoại và kiểm tra bảo mật độc lập.</w:t>
+        <w:t>Tôi muốn nói trước những giới hạn đã biết. Một là tốc độ: thử với năm người dùng cùng lúc, chỉ 39 trên 60 câu được trả lời, tức 65%, và 63% xong trong 15 giây, trong khi mục tiêu là 95%. Lần đo trước là 34 trên 60. Mọi lỗi ghi nhận được đều là giới hạn tốc độ của gói AI miễn phí, chưa thấy lỗi nào do phần xử lý của chúng tôi, nhưng cần đo lại với gói trả phí để chắc chắn; những câu không cần AI trả lời trong khoảng 0,3 giây. Cùng nguyên nhân đó, khi chạy 161 câu kiểm thử, 15 câu bị báo AI bận ở lượt đầu; chúng tôi chạy lại và đều đạt. Hai là dữ liệu mẫu: bảng nhà máy là giả lập nên Factory C không có sản lượng, và tháng 5 năm 2025 gần như trống. Ba là AI không ổn định tuyệt đối: cùng một câu có thể được hiểu khác nhau giữa các lần hỏi, và chúng tôi chưa đo điều này một cách bài bản. Bốn là những phần chưa có: giọng nói chưa bật trên bản demo, tài khoản demo đăng nhập bằng nút chọn vai trò chứ chưa phải xác thực thật, giao diện điện thoại và kiểm tra bảo mật độc lập. Vì vậy chúng tôi chưa dùng dữ liệu thật.</w:t>
       </w:r>
     </w:p>
     <w:p>
@@ -1466,7 +1466,7 @@
           <w:color w:val="555B66"/>
           <w:sz w:val="20"/>
         </w:rPr>
-        <w:t>Trên slide: Duyệt kiến trúc, chạy thử với dữ liệu thật.</w:t>
+        <w:t>Trên slide: Duyệt thí điểm có điều kiện, kèm bốn điều kiện trước khi dùng dữ liệu thật.</w:t>
       </w:r>
     </w:p>
     <w:p>
@@ -1478,7 +1478,7 @@
           <w:b w:val="0"/>
           <w:i w:val="0"/>
         </w:rPr>
-        <w:t>Tóm lại, tôi đề xuất duyệt kiến trúc này và chạy thử với dữ liệu thật của công ty. Trên dữ liệu mẫu, hệ thống đã cho thấy khả năng hiểu câu hỏi tiếng Việt, trả lời đúng quyền, và luôn có nguồn để kiểm chứng. Cảm ơn anh chị đã lắng nghe, tôi sẵn sàng trả lời câu hỏi.</w:t>
+        <w:t>Tóm lại, tôi đề xuất duyệt một giai đoạn thí điểm có điều kiện, chưa phải triển khai chính thức. Trên dữ liệu mẫu, hệ thống đã cho thấy khả năng hiểu câu hỏi tiếng Việt, trả lời đúng quyền và có nguồn để kiểm chứng. Trước khi dùng dữ liệu thật, cần bốn điều kiện: duyệt điều khoản dữ liệu của nhà cung cấp AI, kiểm tra bảo mật độc lập, chủ dữ liệu chốt cách tính chỉ số và quyền xem, và đo lại tốc độ với gói AI trả phí. Cảm ơn anh chị đã lắng nghe, tôi sẵn sàng trả lời câu hỏi.</w:t>
       </w:r>
     </w:p>
     <w:p>

</xml_diff>

<commit_message>
Presentation script: drop the forecast slide
</commit_message>
<xml_diff>
--- a/docs/ACBI_bai_trinh_bay.docx
+++ b/docs/ACBI_bai_trinh_bay.docx
@@ -57,7 +57,7 @@
           <w:b w:val="0"/>
           <w:i w:val="0"/>
         </w:rPr>
-        <w:t>Bài gồm 17 slide, thời lượng nói khoảng 11 phút 55 giây, chưa tính hỏi đáp. Mỗi slide có phần chữ trên slide (để nhớ ý) và phần lời nói đầy đủ để đọc hoặc nói theo.</w:t>
+        <w:t>Bài gồm 16 slide, thời lượng nói khoảng 11 phút 5 giây, chưa tính hỏi đáp. Mỗi slide có phần chữ trên slide (để nhớ ý) và phần lời nói đầy đủ để đọc hoặc nói theo.</w:t>
       </w:r>
     </w:p>
     <w:p>
@@ -69,7 +69,7 @@
           <w:b w:val="0"/>
           <w:i w:val="0"/>
         </w:rPr>
-        <w:t>Các con số kiểm thử trong bài là kết quả ngày 13/10/2026 trên bản demo với AI thật: 161 ca (RAG 24, câu hỏi khó 90, so sánh và nhiều yêu cầu 47), đạt 161/161, 48 ca phân quyền đạt 48/48, kèm 287 kiểm thử tự động. Đo tải 5 người dùng đo lại: 39/60 câu trả lời được, 63% dưới 15 giây. Chi tiết ở file Excel ACBI_bao_cao_kiem_thu.xlsx.</w:t>
+        <w:t>Các con số kiểm thử trong bài là kết quả ngày 13/10/2026 trên bản demo với AI thật: 161 ca (RAG 24, câu hỏi khó 90, so sánh và nhiều yêu cầu 47), đạt 161/161 ở trạng thái cuối (lượt đầu: 145 đạt, 1 sai, 15 bị báo AI bận), 48 ca phân quyền đạt 48/48, 29 ca kiểm tra bảo mật nội bộ đạt 29/29, kèm 287 kiểm thử tự động. Đo tải 5 người dùng đo lại: 39/60 câu trả lời được, 63% dưới 15 giây. Chi tiết ở file Excel ACBI_bao_cao_kiem_thu.xlsx.</w:t>
       </w:r>
     </w:p>
     <w:tbl>
@@ -582,7 +582,7 @@
               <w:rPr>
                 <w:sz w:val="20"/>
               </w:rPr>
-              <w:t>Dự báo: có nhãn, có khoảng tin cậy, biết từ chối</w:t>
+              <w:t>Kiểm soát: an toàn và truy vết được thiết kế từ đầu</w:t>
             </w:r>
           </w:p>
         </w:tc>
@@ -623,47 +623,6 @@
               <w:rPr>
                 <w:sz w:val="20"/>
               </w:rPr>
-              <w:t>Kiểm soát: an toàn và truy vết được thiết kế từ đầu</w:t>
-            </w:r>
-          </w:p>
-        </w:tc>
-        <w:tc>
-          <w:tcPr>
-            <w:tcW w:type="dxa" w:w="1928"/>
-          </w:tcPr>
-          <w:p>
-            <w:r>
-              <w:rPr>
-                <w:sz w:val="20"/>
-              </w:rPr>
-              <w:t>50 giây</w:t>
-            </w:r>
-          </w:p>
-        </w:tc>
-      </w:tr>
-      <w:tr>
-        <w:tc>
-          <w:tcPr>
-            <w:tcW w:type="dxa" w:w="907"/>
-          </w:tcPr>
-          <w:p>
-            <w:r>
-              <w:rPr>
-                <w:sz w:val="20"/>
-              </w:rPr>
-              <w:t>13</w:t>
-            </w:r>
-          </w:p>
-        </w:tc>
-        <w:tc>
-          <w:tcPr>
-            <w:tcW w:type="dxa" w:w="6576"/>
-          </w:tcPr>
-          <w:p>
-            <w:r>
-              <w:rPr>
-                <w:sz w:val="20"/>
-              </w:rPr>
               <w:t>Kết quả kiểm thử: số liệu được kiểm chứng ra sao</w:t>
             </w:r>
           </w:p>
@@ -692,7 +651,7 @@
               <w:rPr>
                 <w:sz w:val="20"/>
               </w:rPr>
-              <w:t>14</w:t>
+              <w:t>13</w:t>
             </w:r>
           </w:p>
         </w:tc>
@@ -733,7 +692,7 @@
               <w:rPr>
                 <w:sz w:val="20"/>
               </w:rPr>
-              <w:t>15</w:t>
+              <w:t>14</w:t>
             </w:r>
           </w:p>
         </w:tc>
@@ -774,7 +733,7 @@
               <w:rPr>
                 <w:sz w:val="20"/>
               </w:rPr>
-              <w:t>16</w:t>
+              <w:t>15</w:t>
             </w:r>
           </w:p>
         </w:tc>
@@ -815,7 +774,7 @@
               <w:rPr>
                 <w:sz w:val="20"/>
               </w:rPr>
-              <w:t>17</w:t>
+              <w:t>16</w:t>
             </w:r>
           </w:p>
         </w:tc>
@@ -884,7 +843,7 @@
                 <w:b/>
                 <w:sz w:val="20"/>
               </w:rPr>
-              <w:t>11 phút 55 giây</w:t>
+              <w:t>11 phút 5 giây</w:t>
             </w:r>
           </w:p>
         </w:tc>
@@ -1248,41 +1207,7 @@
         <w:pStyle w:val="Heading2"/>
       </w:pPr>
       <w:r>
-        <w:t>Slide 11 · Dự báo: có nhãn, có khoảng tin cậy, biết từ chối  (~50 giây)</w:t>
-      </w:r>
-    </w:p>
-    <w:p>
-      <w:pPr>
-        <w:spacing w:after="80" w:line="300" w:lineRule="auto"/>
-      </w:pPr>
-      <w:r>
-        <w:rPr>
-          <w:b w:val="0"/>
-          <w:i/>
-          <w:color w:val="555B66"/>
-          <w:sz w:val="20"/>
-        </w:rPr>
-        <w:t>Trên slide: Phương pháp ETS chuẩn; luôn ghi rõ là dự báo, kèm khoảng tin cậy 95%; lệch quá 35% khi thử lại thì không đưa số; thử lùi dần: sai số 18% đến 26%, tương đương phương pháp đơn giản.</w:t>
-      </w:r>
-    </w:p>
-    <w:p>
-      <w:pPr>
-        <w:spacing w:after="200" w:line="300" w:lineRule="auto"/>
-      </w:pPr>
-      <w:r>
-        <w:rPr>
-          <w:b w:val="0"/>
-          <w:i w:val="0"/>
-        </w:rPr>
-        <w:t>Hệ thống còn dự báo được doanh thu và sản lượng. Dự báo dùng phương pháp làm trơn hàm mũ, giống gói forecast của R và thư viện statsmodels; tôi đã đối chiếu và kết quả khớp với statsmodels. Câu trả lời luôn mở đầu bằng "Dự báo, không phải số liệu đã ghi nhận", kèm khoảng dao động 95% và mức sai số khi thử lại. Quan trọng nhất: hệ thống thử dự báo lại 6 tháng gần nhất, nếu lệch quá 35% thì từ chối, không đưa ra con số. Trên dữ liệu mẫu, một vài khu vực như Pháp, Canada bị từ chối vì lý do này. Chúng tôi cũng thử lùi dần nhiều mốc và so với cách tính đơn giản như lấy tháng trước hoặc trung bình ba tháng: sai số khoảng 18 đến 26 phần trăm, ngang với các cách đó. Vì vậy dự báo luôn kèm sai số và có cơ chế từ chối, và chúng tôi không quảng bá độ chính xác của nó. Khoảng dao động 95% trong thử nghiệm chỉ phủ được từ 67% đến 100% số lần, tức chưa hiệu chỉnh tốt. Đây là chức năng tạm thời, phạm vi dự báo còn phụ thuộc nghiệp vụ. Lưu ý: tháng 5 năm 2025 của dữ liệu mẫu gần như trống nên đường dự báo thấp hơn các tháng trước.</w:t>
-      </w:r>
-    </w:p>
-    <w:p>
-      <w:pPr>
-        <w:pStyle w:val="Heading2"/>
-      </w:pPr>
-      <w:r>
-        <w:t>Slide 12 · Kiểm soát: an toàn và truy vết được thiết kế từ đầu  (~50 giây)</w:t>
+        <w:t>Slide 11 · Kiểm soát: an toàn và truy vết được thiết kế từ đầu  (~50 giây)</w:t>
       </w:r>
     </w:p>
     <w:p>
@@ -1308,7 +1233,7 @@
           <w:b w:val="0"/>
           <w:i w:val="0"/>
         </w:rPr>
-        <w:t>Có bốn cơ chế kiểm soát. Một, phân quyền theo vai trò: quản lý xem được tất cả, kinh doanh chỉ xem doanh thu, sản xuất chỉ xem nhà máy của mình, còn IT quản lý tài khoản nhưng không xem số liệu kinh doanh. Hai, một lớp kiểm tra chung cho cả hai đường: chỉ cho phép đọc dữ liệu từ các bảng được phép, giá trị người dùng nhập luôn được truyền riêng, chạy ở chế độ chỉ đọc, có giới hạn thời gian và số dòng. Ba, không bịa số liệu: hệ thống phân biệt rõ "không có dữ liệu", "bằng không" và "lỗi kỹ thuật"; dự báo luôn ghi rõ là dự báo và bị từ chối khi thử lại cho thấy không đáng tin. Bốn, mỗi câu trả lời được lưu kèm câu lệnh đã chạy, các giá trị đã dùng, thời điểm lấy dữ liệu và phiên bản cách tính, để có thể kiểm chứng lại bất cứ lúc nào.</w:t>
+        <w:t>Có bốn cơ chế kiểm soát. Một, phân quyền theo vai trò: quản lý xem được tất cả, kinh doanh chỉ xem doanh thu, sản xuất chỉ xem nhà máy của mình, còn IT quản lý tài khoản nhưng không xem số liệu kinh doanh. Hai, một lớp kiểm tra chung cho cả hai đường: chỉ cho phép đọc dữ liệu từ các bảng được phép, giá trị người dùng nhập luôn được truyền riêng, chạy ở chế độ chỉ đọc, có giới hạn thời gian và số dòng. Ba, không bịa số liệu: hệ thống phân biệt rõ "không có dữ liệu", "bằng không" và "lỗi kỹ thuật". Bốn, mỗi câu trả lời được lưu kèm câu lệnh đã chạy, các giá trị đã dùng, thời điểm lấy dữ liệu và phiên bản cách tính, để có thể kiểm chứng lại bất cứ lúc nào.</w:t>
       </w:r>
     </w:p>
     <w:p>
@@ -1316,7 +1241,7 @@
         <w:pStyle w:val="Heading2"/>
       </w:pPr>
       <w:r>
-        <w:t>Slide 13 · Kết quả kiểm thử: số liệu được kiểm chứng ra sao  (~45 giây)</w:t>
+        <w:t>Slide 12 · Kết quả kiểm thử: số liệu được kiểm chứng ra sao  (~45 giây)</w:t>
       </w:r>
     </w:p>
     <w:p>
@@ -1350,7 +1275,7 @@
         <w:pStyle w:val="Heading2"/>
       </w:pPr>
       <w:r>
-        <w:t>Slide 14 · Giới hạn đã biết  (~50 giây)</w:t>
+        <w:t>Slide 13 · Giới hạn đã biết  (~50 giây)</w:t>
       </w:r>
     </w:p>
     <w:p>
@@ -1384,7 +1309,7 @@
         <w:pStyle w:val="Heading2"/>
       </w:pPr>
       <w:r>
-        <w:t>Slide 15 · Chi phí AI ước tính: API hay máy chủ riêng  (~40 giây)</w:t>
+        <w:t>Slide 14 · Chi phí AI ước tính: API hay máy chủ riêng  (~40 giây)</w:t>
       </w:r>
     </w:p>
     <w:p>
@@ -1418,7 +1343,7 @@
         <w:pStyle w:val="Heading2"/>
       </w:pPr>
       <w:r>
-        <w:t>Slide 16 · Rủi ro và bước tiếp theo  (~45 giây)</w:t>
+        <w:t>Slide 15 · Rủi ro và bước tiếp theo  (~45 giây)</w:t>
       </w:r>
     </w:p>
     <w:p>
@@ -1444,7 +1369,7 @@
           <w:b w:val="0"/>
           <w:i w:val="0"/>
         </w:rPr>
-        <w:t>Có bốn rủi ro chính, đã nêu trong tài liệu cùng cách giảm thiểu: số liệu sai dù câu lệnh vẫn chạy được, lộ dữ liệu ngoài quyền, phụ thuộc vào dịch vụ AI bên ngoài, và phạm vi kiểm thử còn hẹp. Bước tiếp theo tôi đề xuất năm việc. Một, chuyển sang gói AI trả phí rồi đo lại tốc độ, vì kết quả hôm nay bị giới hạn bởi gói miễn phí. Hai, cùng các phòng ban chốt cách tính chỉ số và quyền xem. Ba, xây bộ 100 đến 200 câu hỏi thật và chạy nhiều lần để đo độ ổn định. Bốn, chạy thử với dữ liệu thật của công ty, nhưng chỉ sau khi nhà cung cấp AI được duyệt về điều khoản lưu dữ liệu và đã kiểm tra bảo mật độc lập. Năm, tài liệu giải pháp đã được cập nhật lên bản 1.1; riêng phần dự báo chưa đưa vào vì còn phụ thuộc nghiệp vụ. Ở bản chính thức, chúng tôi dùng một nhà cung cấp AI trả phí hoặc mô hình chạy trong công ty; việc luân phiên nhiều AI miễn phí chỉ là cách tạm cho giai đoạn demo.</w:t>
+        <w:t>Có bốn rủi ro chính, đã nêu trong tài liệu cùng cách giảm thiểu: số liệu sai dù câu lệnh vẫn chạy được, lộ dữ liệu ngoài quyền, phụ thuộc vào dịch vụ AI bên ngoài, và phạm vi kiểm thử còn hẹp. Bước tiếp theo tôi đề xuất năm việc. Một, chuyển sang gói AI trả phí rồi đo lại tốc độ, vì kết quả hôm nay bị giới hạn bởi gói miễn phí. Hai, cùng các phòng ban chốt cách tính chỉ số và quyền xem. Ba, xây bộ 100 đến 200 câu hỏi thật và chạy nhiều lần để đo độ ổn định. Bốn, chạy thử với dữ liệu thật của công ty, nhưng chỉ sau khi nhà cung cấp AI được duyệt về điều khoản lưu dữ liệu và đã kiểm tra bảo mật độc lập. Năm, tài liệu giải pháp đã được cập nhật lên bản 1.1. Ở bản chính thức, chúng tôi dùng một nhà cung cấp AI trả phí hoặc mô hình chạy trong công ty; việc luân phiên nhiều AI miễn phí chỉ là cách tạm cho giai đoạn demo.</w:t>
       </w:r>
     </w:p>
     <w:p>
@@ -1452,7 +1377,7 @@
         <w:pStyle w:val="Heading2"/>
       </w:pPr>
       <w:r>
-        <w:t>Slide 17 · Đề xuất và kết  (~20 giây)</w:t>
+        <w:t>Slide 16 · Đề xuất và kết  (~20 giây)</w:t>
       </w:r>
     </w:p>
     <w:p>
@@ -1656,31 +1581,6 @@
           <w:i w:val="0"/>
         </w:rPr>
         <w:t>Hiện chứng minh trên dữ liệu mẫu AdventureWorks. Chạy thử với dữ liệu thật là bước đề xuất tiếp theo, kèm việc chốt định nghĩa chỉ số và phân quyền với các phòng ban.</w:t>
-      </w:r>
-    </w:p>
-    <w:p>
-      <w:pPr>
-        <w:spacing w:after="40" w:line="300" w:lineRule="auto"/>
-      </w:pPr>
-      <w:r>
-        <w:rPr>
-          <w:b/>
-          <w:i w:val="0"/>
-          <w:color w:val="14213D"/>
-        </w:rPr>
-        <w:t>Dự báo có đáng tin không?</w:t>
-      </w:r>
-    </w:p>
-    <w:p>
-      <w:pPr>
-        <w:spacing w:after="200" w:line="300" w:lineRule="auto"/>
-      </w:pPr>
-      <w:r>
-        <w:rPr>
-          <w:b w:val="0"/>
-          <w:i w:val="0"/>
-        </w:rPr>
-        <w:t>Dùng phương pháp chuẩn (ETS, đối chiếu khớp statsmodels), luôn ghi rõ là dự báo kèm khoảng tin cậy 95%. Hệ thống thử dự báo lại 6 tháng gần nhất và từ chối nếu lệch quá 35%. Thử lùi dần trên dữ liệu mẫu, sai số khoảng 18% đến 26%, tương đương phương pháp đơn giản (lấy tháng trước, trung bình 3 tháng), nên không quảng bá độ chính xác; cần dữ liệu thật dài hơn để đánh giá lại.</w:t>
       </w:r>
     </w:p>
     <w:p>

</xml_diff>

<commit_message>
Record the off-topic cost limit in the Excel, the script and the limits note
</commit_message>
<xml_diff>
--- a/docs/ACBI_bai_trinh_bay.docx
+++ b/docs/ACBI_bai_trinh_bay.docx
@@ -1301,7 +1301,7 @@
           <w:b w:val="0"/>
           <w:i w:val="0"/>
         </w:rPr>
-        <w:t>Tôi muốn nói trước những giới hạn đã biết. Một là tốc độ: thử với năm người dùng cùng lúc, chỉ 39 trên 60 câu được trả lời, tức 65%, và 63% xong trong 15 giây, trong khi mục tiêu là 95%. Lần đo trước là 34 trên 60. Mọi lỗi ghi nhận được đều là giới hạn tốc độ của gói AI miễn phí, chưa thấy lỗi nào do phần xử lý của chúng tôi, nhưng cần đo lại với gói trả phí để chắc chắn; những câu không cần AI trả lời trong khoảng 0,3 giây. Cùng nguyên nhân đó, khi chạy 161 câu kiểm thử, 15 câu bị báo AI bận ở lượt đầu; chúng tôi chạy lại và đều đạt. Hai là dữ liệu mẫu: bảng nhà máy là giả lập nên Factory C không có sản lượng, và tháng 5 năm 2025 gần như trống. Ba là AI không ổn định tuyệt đối: cùng một câu có thể được hiểu khác nhau giữa các lần hỏi, và chúng tôi chưa đo điều này một cách bài bản. Bốn là những phần chưa có: giọng nói chưa bật trên bản demo, tài khoản demo đăng nhập bằng nút chọn vai trò chứ chưa phải xác thực thật, giao diện điện thoại và kiểm tra bảo mật độc lập. Vì vậy chúng tôi chưa dùng dữ liệu thật.</w:t>
+        <w:t>Tôi muốn nói trước những giới hạn đã biết. Một là tốc độ: thử với năm người dùng cùng lúc, chỉ 39 trên 60 câu được trả lời, tức 65%, và 63% xong trong 15 giây, trong khi mục tiêu là 95%. Lần đo trước là 34 trên 60. Mọi lỗi ghi nhận được đều là giới hạn tốc độ của gói AI miễn phí, chưa thấy lỗi nào do phần xử lý của chúng tôi, nhưng cần đo lại với gói trả phí để chắc chắn; những câu không cần AI trả lời trong khoảng 0,3 giây. Cùng nguyên nhân đó, khi chạy 161 câu kiểm thử, 15 câu bị báo AI bận ở lượt đầu; chúng tôi chạy lại và đều đạt. Hai là dữ liệu mẫu: bảng nhà máy là giả lập nên Factory C không có sản lượng, và tháng 5 năm 2025 gần như trống. Ba là AI không ổn định tuyệt đối: cùng một câu có thể được hiểu khác nhau giữa các lần hỏi, và chúng tôi chưa đo điều này một cách bài bản. Bốn là những phần chưa có: giọng nói chưa bật trên bản demo, tài khoản demo đăng nhập bằng nút chọn vai trò chứ chưa phải xác thực thật, giao diện điện thoại và kiểm tra bảo mật độc lập. Vì vậy chúng tôi chưa dùng dữ liệu thật. Ngoài ra, câu hỏi ngoài chủ đề như bài tập hay viết văn bị từ chối nhưng vẫn tốn một đến hai lần gọi AI, mỗi câu chưa tới một phần nghìn đô la; hệ thống cũng chưa có giới hạn số câu theo từng người dùng, việc này nằm trong kế hoạch trước khi chuyển sang gói trả phí.</w:t>
       </w:r>
     </w:p>
     <w:p>
@@ -1581,6 +1581,31 @@
           <w:i w:val="0"/>
         </w:rPr>
         <w:t>Hiện chứng minh trên dữ liệu mẫu AdventureWorks. Chạy thử với dữ liệu thật là bước đề xuất tiếp theo, kèm việc chốt định nghĩa chỉ số và phân quyền với các phòng ban.</w:t>
+      </w:r>
+    </w:p>
+    <w:p>
+      <w:pPr>
+        <w:spacing w:after="40" w:line="300" w:lineRule="auto"/>
+      </w:pPr>
+      <w:r>
+        <w:rPr>
+          <w:b/>
+          <w:i w:val="0"/>
+          <w:color w:val="14213D"/>
+        </w:rPr>
+        <w:t>Nếu người dùng hỏi linh tinh hoặc đưa bài tập cho AI làm thì sao?</w:t>
+      </w:r>
+    </w:p>
+    <w:p>
+      <w:pPr>
+        <w:spacing w:after="200" w:line="300" w:lineRule="auto"/>
+      </w:pPr>
+      <w:r>
+        <w:rPr>
+          <w:b w:val="0"/>
+          <w:i w:val="0"/>
+        </w:rPr>
+        <w:t>Hệ thống từ chối bài tập, viết văn, viết code và chuyện cười, rồi gợi ý các chỉ số hỗ trợ; chúng tôi đã thử 6 câu như vậy trên bản demo. Những câu này vẫn tốn 1 đến 2 lần gọi AI, khoảng 0,0007 đô la mỗi câu theo giá Haiku 5.5, tức 1.000 câu chưa tới 1 đô la. Có hai điểm chúng tôi biết còn thiếu: hệ thống vẫn dịch được văn bản ngắn, và chưa có giới hạn số câu theo từng người dùng. Cả hai nằm trong kế hoạch xử lý trước khi chuyển sang gói AI trả phí: từ chối bằng quy tắc cho các mẫu rõ ràng, dùng câu từ chối cố định, bỏ quyền dịch, và giới hạn theo người dùng.</w:t>
       </w:r>
     </w:p>
     <w:p>

</xml_diff>

<commit_message>
Voice input is on in the hosted demo (Groq Whisper); update the Excel, script and slides
</commit_message>
<xml_diff>
--- a/docs/ACBI_bai_trinh_bay.docx
+++ b/docs/ACBI_bai_trinh_bay.docx
@@ -893,7 +893,7 @@
           <w:b w:val="0"/>
           <w:i w:val="0"/>
         </w:rPr>
-        <w:t>Xin chào anh chị. Hôm nay tôi giới thiệu ACBI, một hệ thống cho phép hỏi dữ liệu kinh doanh bằng tiếng Việt, qua chat hoặc giọng nói, và nhận lại câu trả lời có số liệu kiểm chứng được. Giọng nói có trong thiết kế nhưng chưa bật trên bản demo hôm nay, nên phần demo chạy bằng chat. Phần trình bày khoảng mười hai phút, gồm giải pháp, demo trên hệ thống đang chạy và kết quả kiểm thử, sau đó là phần hỏi đáp.</w:t>
+        <w:t>Xin chào anh chị. Hôm nay tôi giới thiệu ACBI, một hệ thống cho phép hỏi dữ liệu kinh doanh bằng tiếng Việt, qua chat hoặc giọng nói, và nhận lại câu trả lời có số liệu kiểm chứng được. Bản demo đã bật giọng nói bằng dịch vụ chuyển giọng nói Whisper, nhưng hôm nay tôi demo bằng chat cho nhanh. Phần trình bày khoảng mười hai phút, gồm giải pháp, demo trên hệ thống đang chạy và kết quả kiểm thử, sau đó là phần hỏi đáp.</w:t>
       </w:r>
     </w:p>
     <w:p>
@@ -1301,7 +1301,7 @@
           <w:b w:val="0"/>
           <w:i w:val="0"/>
         </w:rPr>
-        <w:t>Tôi muốn nói trước những giới hạn đã biết. Một là tốc độ: thử với năm người dùng cùng lúc, chỉ 39 trên 60 câu được trả lời, tức 65%, và 63% xong trong 15 giây, trong khi mục tiêu là 95%. Lần đo trước là 34 trên 60. Mọi lỗi ghi nhận được đều là giới hạn tốc độ của gói AI miễn phí, chưa thấy lỗi nào do phần xử lý của chúng tôi, nhưng cần đo lại với gói trả phí để chắc chắn; những câu không cần AI trả lời trong khoảng 0,3 giây. Cùng nguyên nhân đó, khi chạy 161 câu kiểm thử, 15 câu bị báo AI bận ở lượt đầu; chúng tôi chạy lại và đều đạt. Hai là dữ liệu mẫu: bảng nhà máy là giả lập nên Factory C không có sản lượng, và tháng 5 năm 2025 gần như trống. Ba là AI không ổn định tuyệt đối: cùng một câu có thể được hiểu khác nhau giữa các lần hỏi, và chúng tôi chưa đo điều này một cách bài bản. Bốn là những phần chưa có: giọng nói chưa bật trên bản demo, tài khoản demo đăng nhập bằng nút chọn vai trò chứ chưa phải xác thực thật, giao diện điện thoại và kiểm tra bảo mật độc lập. Vì vậy chúng tôi chưa dùng dữ liệu thật. Ngoài ra, câu hỏi ngoài chủ đề như bài tập hay viết văn bị từ chối nhưng vẫn tốn một đến hai lần gọi AI, mỗi câu chưa tới một phần nghìn đô la; hệ thống cũng chưa có giới hạn số câu theo từng người dùng, việc này nằm trong kế hoạch trước khi chuyển sang gói trả phí.</w:t>
+        <w:t>Tôi muốn nói trước những giới hạn đã biết. Một là tốc độ: thử với năm người dùng cùng lúc, chỉ 39 trên 60 câu được trả lời, tức 65%, và 63% xong trong 15 giây, trong khi mục tiêu là 95%. Lần đo trước là 34 trên 60. Mọi lỗi ghi nhận được đều là giới hạn tốc độ của gói AI miễn phí, chưa thấy lỗi nào do phần xử lý của chúng tôi, nhưng cần đo lại với gói trả phí để chắc chắn; những câu không cần AI trả lời trong khoảng 0,3 giây. Cùng nguyên nhân đó, khi chạy 161 câu kiểm thử, 15 câu bị báo AI bận ở lượt đầu; chúng tôi chạy lại và đều đạt. Hai là dữ liệu mẫu: bảng nhà máy là giả lập nên Factory C không có sản lượng, và tháng 5 năm 2025 gần như trống. Ba là AI không ổn định tuyệt đối: cùng một câu có thể được hiểu khác nhau giữa các lần hỏi, và chúng tôi chưa đo điều này một cách bài bản. Bốn là những phần chưa có: giọng nói đã bật trên bản demo nhưng chưa thử tiếng Việt trong môi trường thật, tài khoản demo đăng nhập bằng nút chọn vai trò chứ chưa phải xác thực thật, giao diện điện thoại và kiểm tra bảo mật độc lập. Vì vậy chúng tôi chưa dùng dữ liệu thật. Ngoài ra, câu hỏi ngoài chủ đề như bài tập hay viết văn bị từ chối nhưng vẫn tốn một đến hai lần gọi AI, mỗi câu chưa tới một phần nghìn đô la; hệ thống cũng chưa có giới hạn số câu theo từng người dùng, việc này nằm trong kế hoạch trước khi chuyển sang gói trả phí.</w:t>
       </w:r>
     </w:p>
     <w:p>

</xml_diff>